<commit_message>
Fase 3: secciones 1-4.1 y 13 del informe redactadas y presentación final armada
- Introducción, objetivos, alcance, avance contra el cronograma y escalabilidad (cifras del presupuesto de la Fase 1)
- Presentación de 14 diapositivas con el diseño de la Fase 2 y su generador; capturas y números del BI pendientes
- Tablas: el ancho de columna considera el encabezado
</commit_message>
<xml_diff>
--- a/Entrega_Fase3_Grupo14/1_Informe/informe_fase3_PLANTILLA.docx
+++ b/Entrega_Fase3_Grupo14/1_Informe/informe_fase3_PLANTILLA.docx
@@ -775,11 +775,22 @@
     </w:p>
     <w:p>
       <w:r>
-        <w:rPr>
-          <w:i/>
-          <w:color w:val="808080"/>
-        </w:rPr>
-        <w:t>Qué es RutaMoto en dos líneas, qué hizo cada fase y qué cierra esta: el sitio, la integración, el BI y la evaluación de los objetivos. Un párrafo por idea, cuatro párrafos como máximo.</w:t>
+        <w:t>RutaMoto es la tienda en línea de repuestos y accesorios para motocicleta que el Grupo 14 desarrolla con el financiamiento y el acompañamiento de QuetzalDev. La primera fase documentó su diagnóstico, sus objetivos y la selección de Odoo 18.0 Community como ERP y CRM sobre una misma base de datos. La segunda dejó el sistema operando: el catálogo de 36 productos con un inventario inicial de Q 45,000, dos productos más creados desde el sistema, 6 proveedores y 40 clientes segmentados, junto con el ciclo completo de compras, el proceso de cotización y una campaña de correo dirigida a un segmento.</w:t>
+      </w:r>
+    </w:p>
+    <w:p>
+      <w:r>
+        <w:t>Este informe corresponde a la tercera y última fase, que la metodología del proyecto dedica a la integración de sistemas y al análisis de resultados. Su propósito es cerrar el ciclo comercial: que un cliente pueda registrarse, elegir productos y pagar en el sitio, y que esa compra quede registrada sin intervención manual en ventas, facturación, inventario y el CRM, y visible para el propio cliente en su portal.</w:t>
+      </w:r>
+    </w:p>
+    <w:p>
+      <w:r>
+        <w:t>El sitio se implementó con el módulo de comercio electrónico de Odoo, sobre la misma base que opera desde la Fase 2. Esa decisión, tomada en la Fase 1 al seleccionar el ERP, es la que hace posible la integración: el sitio no copia productos, precios ni existencias de otro sistema, sino que lee y escribe los mismos registros que usan las demás áreas. Las ventas resultantes, junto con una historia de pedidos anteriores, se analizan con los informes de inteligencia de negocios del propio Odoo.</w:t>
+      </w:r>
+    </w:p>
+    <w:p>
+      <w:r>
+        <w:t>Con esos datos, el informe vuelve sobre los cuatro objetivos SMART y los indicadores definidos en la Fase 1, evalúa cuáles se cumplieron y cuáles no, y cierra con la propuesta de lo que haría falta para que el prototipo pase a operar como empresa.</w:t>
       </w:r>
     </w:p>
     <w:p>
@@ -826,11 +837,7 @@
     </w:p>
     <w:p>
       <w:r>
-        <w:rPr>
-          <w:i/>
-          <w:color w:val="808080"/>
-        </w:rPr>
-        <w:t>Una oración: dejar el ciclo comercial de RutaMoto operando de punta a punta en línea y medirlo con BI.</w:t>
+        <w:t>Integrar el sitio de comercio electrónico de RutaMoto con el ERP y el CRM, de modo que una venta en línea quede registrada de punta a punta sin intervención manual, y evaluar con reportes de inteligencia de negocios el cumplimiento de los objetivos y los indicadores definidos en la Fase 1.</w:t>
       </w:r>
     </w:p>
     <w:p>
@@ -842,12 +849,35 @@
       </w:r>
     </w:p>
     <w:p>
+      <w:pPr>
+        <w:pStyle w:val="Prrafodelista"/>
+      </w:pPr>
       <w:r>
-        <w:rPr>
-          <w:i/>
-          <w:color w:val="808080"/>
-        </w:rPr>
-        <w:t>Cuatro, uno por pieza: sitio, integración, BI, evaluación de objetivos y escalabilidad.</w:t>
+        <w:t>1.  Publicar el sitio de comercio electrónico con el catálogo completo de 38 productos, registro de clientes, carrito de compras, generación de cotizaciones y facturación.</w:t>
+      </w:r>
+    </w:p>
+    <w:p>
+      <w:pPr>
+        <w:pStyle w:val="Prrafodelista"/>
+      </w:pPr>
+      <w:r>
+        <w:t>2.  Comprobar mediante pruebas de flujo completo que cada venta en línea genera automáticamente el pedido, la factura, el movimiento de inventario y el registro del cliente, y que el portal del cliente refleja su estado.</w:t>
+      </w:r>
+    </w:p>
+    <w:p>
+      <w:pPr>
+        <w:pStyle w:val="Prrafodelista"/>
+      </w:pPr>
+      <w:r>
+        <w:t>3.  Construir con la herramienta de inteligencia de negocios los reportes de inventario y de ventas que pide el enunciado, de forma interactiva y sobre los datos del sistema.</w:t>
+      </w:r>
+    </w:p>
+    <w:p>
+      <w:pPr>
+        <w:pStyle w:val="Prrafodelista"/>
+      </w:pPr>
+      <w:r>
+        <w:t>4.  Contrastar los resultados con las metas de la Fase 1, formular las conclusiones del proyecto y proponer la escalabilidad del sistema.</w:t>
       </w:r>
     </w:p>
     <w:p>
@@ -881,11 +911,7 @@
     </w:p>
     <w:p>
       <w:r>
-        <w:rPr>
-          <w:i/>
-          <w:color w:val="808080"/>
-        </w:rPr>
-        <w:t>Qué entra y qué no. Tiene que decir de forma explícita lo de la historia simulada:</w:t>
+        <w:t>Este informe cubre el trabajo realizado entre el 5 y el 24 de octubre de 2026, el período que el cronograma del enunciado asigna a la Fase 3. Dentro de ese alcance quedan el sitio web de comercio electrónico del punto 16, su integración con el ERP y el CRM, el portal del cliente, las pruebas de flujo completo, los reportes de inventario y de ventas del punto 17 y las conclusiones del punto 19. Cada pieza operativa se acompaña de su manual de usuario con capturas de pantalla, entregado como documento aparte (MU-04 a MU-06).</w:t>
       </w:r>
     </w:p>
     <w:p>
@@ -895,11 +921,12 @@
     </w:p>
     <w:p>
       <w:r>
-        <w:rPr>
-          <w:i/>
-          <w:color w:val="808080"/>
-        </w:rPr>
-        <w:t>Fuera de alcance (del enunciado, alcance opcional): pasarela de pago real, aplicación móvil, contabilidad completa.</w:t>
+        <w:t>Quedan fuera los elementos que el enunciado declara opcionales: la integración con una pasarela de pago real, la aplicación móvil y los módulos contables o de recursos humanos más allá de la facturación. Se mencionan solo en la propuesta de escalabilidad.</w:t>
+      </w:r>
+    </w:p>
+    <w:p>
+      <w:r>
+        <w:t>Conviene señalar cuatro límites del trabajo. El primero es que el sistema sigue instalado en el equipo de uno de los integrantes, con acceso remoto temporal para el resto, igual que en la Fase 2. El segundo es que los pagos del sitio se hicieron con un proveedor de pago en modo de prueba, que confirma la transacción sin mover dinero. El tercero es que los correos se entregaron a un servidor de correo de pruebas, porque los clientes del caso son ficticios. El cuarto es el tamaño de la muestra: las ventas reales del sitio son una docena de pedidos hechos por el propio equipo, de modo que los indicadores que dependen de los visitantes, como la tasa de conversión, se reportan como medición del prototipo y no como comportamiento del mercado.</w:t>
       </w:r>
     </w:p>
     <w:p>
@@ -942,6 +969,16 @@
       </w:pPr>
       <w:r>
         <w:t>Avance contra el cronograma</w:t>
+      </w:r>
+    </w:p>
+    <w:p>
+      <w:r>
+        <w:t>La tabla siguiente retoma las actividades que el cronograma de la Fase 1 asignó a esta tercera fase. El reparto formal del trabajo se hizo el 20 de octubre de 2026, después de las fechas de inicio planificadas para las tres primeras actividades.</w:t>
+      </w:r>
+    </w:p>
+    <w:p>
+      <w:r>
+        <w:t>Además, cambió el responsable de dos de ellas. El sitio y su integración quedaron con el rol 3, porque la instancia de Odoo está en su equipo desde la Fase 1 y la configuración del sitio la requiere de forma directa. Los reportes de inteligencia de negocios pasaron al rol 4, que ya administraba el CRM. El rol 2 asumió las pruebas de flujo completo y el portal del cliente, como continuación de las cotizaciones y del informe de inventario que tuvo a su cargo en la Fase 2.</w:t>
       </w:r>
     </w:p>
     <w:p>
@@ -961,11 +998,12 @@
         <w:tblLook w:firstColumn="1" w:firstRow="1" w:lastColumn="0" w:lastRow="0" w:noHBand="0" w:noVBand="1" w:val="04A0"/>
       </w:tblPr>
       <w:tblGrid>
-        <w:gridCol w:w="1850"/>
-        <w:gridCol w:w="1850"/>
-        <w:gridCol w:w="1850"/>
-        <w:gridCol w:w="1850"/>
-        <w:gridCol w:w="1850"/>
+        <w:gridCol w:w="1542"/>
+        <w:gridCol w:w="1542"/>
+        <w:gridCol w:w="1542"/>
+        <w:gridCol w:w="1542"/>
+        <w:gridCol w:w="1542"/>
+        <w:gridCol w:w="1542"/>
       </w:tblGrid>
       <w:tr>
         <w:trPr>
@@ -974,7 +1012,7 @@
         </w:trPr>
         <w:tc>
           <w:tcPr>
-            <w:tcW w:type="dxa" w:w="2827"/>
+            <w:tcW w:type="dxa" w:w="2419"/>
           </w:tcPr>
           <w:p>
             <w:pPr>
@@ -993,7 +1031,7 @@
         </w:tc>
         <w:tc>
           <w:tcPr>
-            <w:tcW w:type="dxa" w:w="2003"/>
+            <w:tcW w:type="dxa" w:w="1330"/>
           </w:tcPr>
           <w:p>
             <w:pPr>
@@ -1006,13 +1044,13 @@
                 <w:b/>
                 <w:sz w:val="20"/>
               </w:rPr>
-              <w:t>Responsable</w:t>
-            </w:r>
-          </w:p>
-        </w:tc>
-        <w:tc>
-          <w:tcPr>
-            <w:tcW w:type="dxa" w:w="1414"/>
+              <w:t>Planificado</w:t>
+            </w:r>
+          </w:p>
+        </w:tc>
+        <w:tc>
+          <w:tcPr>
+            <w:tcW w:type="dxa" w:w="1693"/>
           </w:tcPr>
           <w:p>
             <w:pPr>
@@ -1025,13 +1063,13 @@
                 <w:b/>
                 <w:sz w:val="20"/>
               </w:rPr>
-              <w:t>Plan</w:t>
-            </w:r>
-          </w:p>
-        </w:tc>
-        <w:tc>
-          <w:tcPr>
-            <w:tcW w:type="dxa" w:w="1414"/>
+              <w:t>Responsable en la Fase 1</w:t>
+            </w:r>
+          </w:p>
+        </w:tc>
+        <w:tc>
+          <w:tcPr>
+            <w:tcW w:type="dxa" w:w="1693"/>
           </w:tcPr>
           <w:p>
             <w:pPr>
@@ -1044,13 +1082,32 @@
                 <w:b/>
                 <w:sz w:val="20"/>
               </w:rPr>
+              <w:t>Responsable en la Fase 3</w:t>
+            </w:r>
+          </w:p>
+        </w:tc>
+        <w:tc>
+          <w:tcPr>
+            <w:tcW w:type="dxa" w:w="968"/>
+          </w:tcPr>
+          <w:p>
+            <w:pPr>
+              <w:keepNext/>
+              <w:spacing w:after="0" w:line="240" w:lineRule="auto"/>
+              <w:jc w:val="left"/>
+            </w:pPr>
+            <w:r>
+              <w:rPr>
+                <w:b/>
+                <w:sz w:val="20"/>
+              </w:rPr>
               <w:t>Real</w:t>
             </w:r>
           </w:p>
         </w:tc>
         <w:tc>
           <w:tcPr>
-            <w:tcW w:type="dxa" w:w="1414"/>
+            <w:tcW w:type="dxa" w:w="968"/>
           </w:tcPr>
           <w:p>
             <w:pPr>
@@ -1074,7 +1131,7 @@
         </w:trPr>
         <w:tc>
           <w:tcPr>
-            <w:tcW w:type="dxa" w:w="2827"/>
+            <w:tcW w:type="dxa" w:w="2419"/>
           </w:tcPr>
           <w:p>
             <w:pPr>
@@ -1086,13 +1143,13 @@
               <w:rPr>
                 <w:sz w:val="20"/>
               </w:rPr>
-              <w:t>Sitio publicado</w:t>
-            </w:r>
-          </w:p>
-        </w:tc>
-        <w:tc>
-          <w:tcPr>
-            <w:tcW w:type="dxa" w:w="2003"/>
+              <w:t>Sitio web E-commerce</w:t>
+            </w:r>
+          </w:p>
+        </w:tc>
+        <w:tc>
+          <w:tcPr>
+            <w:tcW w:type="dxa" w:w="1330"/>
           </w:tcPr>
           <w:p>
             <w:pPr>
@@ -1104,13 +1161,49 @@
               <w:rPr>
                 <w:sz w:val="20"/>
               </w:rPr>
+              <w:t>5 al 15 oct</w:t>
+            </w:r>
+          </w:p>
+        </w:tc>
+        <w:tc>
+          <w:tcPr>
+            <w:tcW w:type="dxa" w:w="1693"/>
+          </w:tcPr>
+          <w:p>
+            <w:pPr>
+              <w:keepNext/>
+              <w:spacing w:after="0" w:line="240" w:lineRule="auto"/>
+              <w:jc w:val="left"/>
+            </w:pPr>
+            <w:r>
+              <w:rPr>
+                <w:sz w:val="20"/>
+              </w:rPr>
+              <w:t>Rol 4</w:t>
+            </w:r>
+          </w:p>
+        </w:tc>
+        <w:tc>
+          <w:tcPr>
+            <w:tcW w:type="dxa" w:w="1693"/>
+          </w:tcPr>
+          <w:p>
+            <w:pPr>
+              <w:keepNext/>
+              <w:spacing w:after="0" w:line="240" w:lineRule="auto"/>
+              <w:jc w:val="left"/>
+            </w:pPr>
+            <w:r>
+              <w:rPr>
+                <w:sz w:val="20"/>
+              </w:rPr>
               <w:t>Rol 3</w:t>
             </w:r>
           </w:p>
         </w:tc>
         <w:tc>
           <w:tcPr>
-            <w:tcW w:type="dxa" w:w="1414"/>
+            <w:tcW w:type="dxa" w:w="968"/>
           </w:tcPr>
           <w:p>
             <w:pPr>
@@ -1122,30 +1215,12 @@
               <w:rPr>
                 <w:sz w:val="20"/>
               </w:rPr>
-              <w:t>21-10</w:t>
-            </w:r>
-          </w:p>
-        </w:tc>
-        <w:tc>
-          <w:tcPr>
-            <w:tcW w:type="dxa" w:w="1414"/>
-          </w:tcPr>
-          <w:p>
-            <w:pPr>
-              <w:keepNext/>
-              <w:spacing w:after="0" w:line="240" w:lineRule="auto"/>
-              <w:jc w:val="left"/>
-            </w:pPr>
-            <w:r>
-              <w:rPr>
-                <w:sz w:val="20"/>
-              </w:rPr>
-            </w:r>
-          </w:p>
-        </w:tc>
-        <w:tc>
-          <w:tcPr>
-            <w:tcW w:type="dxa" w:w="1414"/>
+            </w:r>
+          </w:p>
+        </w:tc>
+        <w:tc>
+          <w:tcPr>
+            <w:tcW w:type="dxa" w:w="968"/>
           </w:tcPr>
           <w:p>
             <w:pPr>
@@ -1167,7 +1242,7 @@
         </w:trPr>
         <w:tc>
           <w:tcPr>
-            <w:tcW w:type="dxa" w:w="2827"/>
+            <w:tcW w:type="dxa" w:w="2419"/>
           </w:tcPr>
           <w:p>
             <w:pPr>
@@ -1179,13 +1254,13 @@
               <w:rPr>
                 <w:sz w:val="20"/>
               </w:rPr>
-              <w:t>Historia cargada</w:t>
-            </w:r>
-          </w:p>
-        </w:tc>
-        <w:tc>
-          <w:tcPr>
-            <w:tcW w:type="dxa" w:w="2003"/>
+              <w:t>Integración ERP / CRM / Web y portal</w:t>
+            </w:r>
+          </w:p>
+        </w:tc>
+        <w:tc>
+          <w:tcPr>
+            <w:tcW w:type="dxa" w:w="1330"/>
           </w:tcPr>
           <w:p>
             <w:pPr>
@@ -1197,13 +1272,31 @@
               <w:rPr>
                 <w:sz w:val="20"/>
               </w:rPr>
+              <w:t>10 al 18 oct</w:t>
+            </w:r>
+          </w:p>
+        </w:tc>
+        <w:tc>
+          <w:tcPr>
+            <w:tcW w:type="dxa" w:w="1693"/>
+          </w:tcPr>
+          <w:p>
+            <w:pPr>
+              <w:keepNext/>
+              <w:spacing w:after="0" w:line="240" w:lineRule="auto"/>
+              <w:jc w:val="left"/>
+            </w:pPr>
+            <w:r>
+              <w:rPr>
+                <w:sz w:val="20"/>
+              </w:rPr>
               <w:t>Rol 3</w:t>
             </w:r>
           </w:p>
         </w:tc>
         <w:tc>
           <w:tcPr>
-            <w:tcW w:type="dxa" w:w="1414"/>
+            <w:tcW w:type="dxa" w:w="1693"/>
           </w:tcPr>
           <w:p>
             <w:pPr>
@@ -1215,13 +1308,13 @@
               <w:rPr>
                 <w:sz w:val="20"/>
               </w:rPr>
-              <w:t>21-10</w:t>
-            </w:r>
-          </w:p>
-        </w:tc>
-        <w:tc>
-          <w:tcPr>
-            <w:tcW w:type="dxa" w:w="1414"/>
+              <w:t>Roles 3, 2 y 4</w:t>
+            </w:r>
+          </w:p>
+        </w:tc>
+        <w:tc>
+          <w:tcPr>
+            <w:tcW w:type="dxa" w:w="968"/>
           </w:tcPr>
           <w:p>
             <w:pPr>
@@ -1238,7 +1331,7 @@
         </w:tc>
         <w:tc>
           <w:tcPr>
-            <w:tcW w:type="dxa" w:w="1414"/>
+            <w:tcW w:type="dxa" w:w="968"/>
           </w:tcPr>
           <w:p>
             <w:pPr>
@@ -1260,7 +1353,7 @@
         </w:trPr>
         <w:tc>
           <w:tcPr>
-            <w:tcW w:type="dxa" w:w="2827"/>
+            <w:tcW w:type="dxa" w:w="2419"/>
           </w:tcPr>
           <w:p>
             <w:pPr>
@@ -1272,13 +1365,13 @@
               <w:rPr>
                 <w:sz w:val="20"/>
               </w:rPr>
-              <w:t>Pedidos por el sitio</w:t>
-            </w:r>
-          </w:p>
-        </w:tc>
-        <w:tc>
-          <w:tcPr>
-            <w:tcW w:type="dxa" w:w="2003"/>
+              <w:t>Reportes de inteligencia de negocios</w:t>
+            </w:r>
+          </w:p>
+        </w:tc>
+        <w:tc>
+          <w:tcPr>
+            <w:tcW w:type="dxa" w:w="1330"/>
           </w:tcPr>
           <w:p>
             <w:pPr>
@@ -1290,13 +1383,13 @@
               <w:rPr>
                 <w:sz w:val="20"/>
               </w:rPr>
-              <w:t>Rol 2 y 4</w:t>
-            </w:r>
-          </w:p>
-        </w:tc>
-        <w:tc>
-          <w:tcPr>
-            <w:tcW w:type="dxa" w:w="1414"/>
+              <w:t>16 al 21 oct</w:t>
+            </w:r>
+          </w:p>
+        </w:tc>
+        <w:tc>
+          <w:tcPr>
+            <w:tcW w:type="dxa" w:w="1693"/>
           </w:tcPr>
           <w:p>
             <w:pPr>
@@ -1308,13 +1401,13 @@
               <w:rPr>
                 <w:sz w:val="20"/>
               </w:rPr>
-              <w:t>22–23-10</w:t>
-            </w:r>
-          </w:p>
-        </w:tc>
-        <w:tc>
-          <w:tcPr>
-            <w:tcW w:type="dxa" w:w="1414"/>
+              <w:t>Rol 2</w:t>
+            </w:r>
+          </w:p>
+        </w:tc>
+        <w:tc>
+          <w:tcPr>
+            <w:tcW w:type="dxa" w:w="1693"/>
           </w:tcPr>
           <w:p>
             <w:pPr>
@@ -1326,12 +1419,30 @@
               <w:rPr>
                 <w:sz w:val="20"/>
               </w:rPr>
-            </w:r>
-          </w:p>
-        </w:tc>
-        <w:tc>
-          <w:tcPr>
-            <w:tcW w:type="dxa" w:w="1414"/>
+              <w:t>Rol 4</w:t>
+            </w:r>
+          </w:p>
+        </w:tc>
+        <w:tc>
+          <w:tcPr>
+            <w:tcW w:type="dxa" w:w="968"/>
+          </w:tcPr>
+          <w:p>
+            <w:pPr>
+              <w:keepNext/>
+              <w:spacing w:after="0" w:line="240" w:lineRule="auto"/>
+              <w:jc w:val="left"/>
+            </w:pPr>
+            <w:r>
+              <w:rPr>
+                <w:sz w:val="20"/>
+              </w:rPr>
+            </w:r>
+          </w:p>
+        </w:tc>
+        <w:tc>
+          <w:tcPr>
+            <w:tcW w:type="dxa" w:w="968"/>
           </w:tcPr>
           <w:p>
             <w:pPr>
@@ -1353,100 +1464,7 @@
         </w:trPr>
         <w:tc>
           <w:tcPr>
-            <w:tcW w:type="dxa" w:w="2827"/>
-          </w:tcPr>
-          <w:p>
-            <w:pPr>
-              <w:keepNext/>
-              <w:spacing w:after="0" w:line="240" w:lineRule="auto"/>
-              <w:jc w:val="left"/>
-            </w:pPr>
-            <w:r>
-              <w:rPr>
-                <w:sz w:val="20"/>
-              </w:rPr>
-              <w:t>Reportes BI</w:t>
-            </w:r>
-          </w:p>
-        </w:tc>
-        <w:tc>
-          <w:tcPr>
-            <w:tcW w:type="dxa" w:w="2003"/>
-          </w:tcPr>
-          <w:p>
-            <w:pPr>
-              <w:keepNext/>
-              <w:spacing w:after="0" w:line="240" w:lineRule="auto"/>
-              <w:jc w:val="left"/>
-            </w:pPr>
-            <w:r>
-              <w:rPr>
-                <w:sz w:val="20"/>
-              </w:rPr>
-              <w:t>Rol 4</w:t>
-            </w:r>
-          </w:p>
-        </w:tc>
-        <w:tc>
-          <w:tcPr>
-            <w:tcW w:type="dxa" w:w="1414"/>
-          </w:tcPr>
-          <w:p>
-            <w:pPr>
-              <w:keepNext/>
-              <w:spacing w:after="0" w:line="240" w:lineRule="auto"/>
-              <w:jc w:val="left"/>
-            </w:pPr>
-            <w:r>
-              <w:rPr>
-                <w:sz w:val="20"/>
-              </w:rPr>
-              <w:t>22–23-10</w:t>
-            </w:r>
-          </w:p>
-        </w:tc>
-        <w:tc>
-          <w:tcPr>
-            <w:tcW w:type="dxa" w:w="1414"/>
-          </w:tcPr>
-          <w:p>
-            <w:pPr>
-              <w:keepNext/>
-              <w:spacing w:after="0" w:line="240" w:lineRule="auto"/>
-              <w:jc w:val="left"/>
-            </w:pPr>
-            <w:r>
-              <w:rPr>
-                <w:sz w:val="20"/>
-              </w:rPr>
-            </w:r>
-          </w:p>
-        </w:tc>
-        <w:tc>
-          <w:tcPr>
-            <w:tcW w:type="dxa" w:w="1414"/>
-          </w:tcPr>
-          <w:p>
-            <w:pPr>
-              <w:keepNext/>
-              <w:spacing w:after="0" w:line="240" w:lineRule="auto"/>
-              <w:jc w:val="left"/>
-            </w:pPr>
-            <w:r>
-              <w:rPr>
-                <w:sz w:val="20"/>
-              </w:rPr>
-            </w:r>
-          </w:p>
-        </w:tc>
-      </w:tr>
-      <w:tr>
-        <w:trPr>
-          <w:cantSplit/>
-        </w:trPr>
-        <w:tc>
-          <w:tcPr>
-            <w:tcW w:type="dxa" w:w="2827"/>
+            <w:tcW w:type="dxa" w:w="2419"/>
           </w:tcPr>
           <w:p>
             <w:pPr>
@@ -1458,13 +1476,13 @@
               <w:rPr>
                 <w:sz w:val="20"/>
               </w:rPr>
-              <w:t>Informe y entrega</w:t>
-            </w:r>
-          </w:p>
-        </w:tc>
-        <w:tc>
-          <w:tcPr>
-            <w:tcW w:type="dxa" w:w="2003"/>
+              <w:t>Conclusiones e informe final</w:t>
+            </w:r>
+          </w:p>
+        </w:tc>
+        <w:tc>
+          <w:tcPr>
+            <w:tcW w:type="dxa" w:w="1330"/>
           </w:tcPr>
           <w:p>
             <w:pPr>
@@ -1476,13 +1494,31 @@
               <w:rPr>
                 <w:sz w:val="20"/>
               </w:rPr>
+              <w:t>20 al 23 oct</w:t>
+            </w:r>
+          </w:p>
+        </w:tc>
+        <w:tc>
+          <w:tcPr>
+            <w:tcW w:type="dxa" w:w="1693"/>
+          </w:tcPr>
+          <w:p>
+            <w:pPr>
+              <w:keepNext w:val="0"/>
+              <w:spacing w:after="0" w:line="240" w:lineRule="auto"/>
+              <w:jc w:val="left"/>
+            </w:pPr>
+            <w:r>
+              <w:rPr>
+                <w:sz w:val="20"/>
+              </w:rPr>
               <w:t>Rol 1</w:t>
             </w:r>
           </w:p>
         </w:tc>
         <w:tc>
           <w:tcPr>
-            <w:tcW w:type="dxa" w:w="1414"/>
+            <w:tcW w:type="dxa" w:w="1693"/>
           </w:tcPr>
           <w:p>
             <w:pPr>
@@ -1494,13 +1530,13 @@
               <w:rPr>
                 <w:sz w:val="20"/>
               </w:rPr>
-              <w:t>23-10</w:t>
-            </w:r>
-          </w:p>
-        </w:tc>
-        <w:tc>
-          <w:tcPr>
-            <w:tcW w:type="dxa" w:w="1414"/>
+              <w:t>Rol 1</w:t>
+            </w:r>
+          </w:p>
+        </w:tc>
+        <w:tc>
+          <w:tcPr>
+            <w:tcW w:type="dxa" w:w="968"/>
           </w:tcPr>
           <w:p>
             <w:pPr>
@@ -1517,7 +1553,7 @@
         </w:tc>
         <w:tc>
           <w:tcPr>
-            <w:tcW w:type="dxa" w:w="1414"/>
+            <w:tcW w:type="dxa" w:w="968"/>
           </w:tcPr>
           <w:p>
             <w:pPr>
@@ -1535,6 +1571,15 @@
       </w:tr>
     </w:tbl>
     <w:p/>
+    <w:p>
+      <w:r>
+        <w:rPr>
+          <w:i/>
+          <w:color w:val="808080"/>
+        </w:rPr>
+        <w:t>Al cierre: llenar «Real» y «Estado» con la fecha en que cada actividad quedó en el repositorio, y una oración que diga cuáles cerraron después de lo planificado.</w:t>
+      </w:r>
+    </w:p>
     <w:p>
       <w:pPr>
         <w:pStyle w:val="Ttulo2"/>
@@ -1890,7 +1935,7 @@
         </w:trPr>
         <w:tc>
           <w:tcPr>
-            <w:tcW w:type="dxa" w:w="2062"/>
+            <w:tcW w:type="dxa" w:w="2022"/>
           </w:tcPr>
           <w:p>
             <w:pPr>
@@ -1909,7 +1954,7 @@
         </w:tc>
         <w:tc>
           <w:tcPr>
-            <w:tcW w:type="dxa" w:w="2474"/>
+            <w:tcW w:type="dxa" w:w="2427"/>
           </w:tcPr>
           <w:p>
             <w:pPr>
@@ -1928,7 +1973,7 @@
         </w:tc>
         <w:tc>
           <w:tcPr>
-            <w:tcW w:type="dxa" w:w="942"/>
+            <w:tcW w:type="dxa" w:w="924"/>
           </w:tcPr>
           <w:p>
             <w:pPr>
@@ -1947,7 +1992,7 @@
         </w:tc>
         <w:tc>
           <w:tcPr>
-            <w:tcW w:type="dxa" w:w="2179"/>
+            <w:tcW w:type="dxa" w:w="2138"/>
           </w:tcPr>
           <w:p>
             <w:pPr>
@@ -1966,7 +2011,7 @@
         </w:tc>
         <w:tc>
           <w:tcPr>
-            <w:tcW w:type="dxa" w:w="1414"/>
+            <w:tcW w:type="dxa" w:w="1560"/>
           </w:tcPr>
           <w:p>
             <w:pPr>
@@ -1990,7 +2035,7 @@
         </w:trPr>
         <w:tc>
           <w:tcPr>
-            <w:tcW w:type="dxa" w:w="2062"/>
+            <w:tcW w:type="dxa" w:w="2022"/>
           </w:tcPr>
           <w:p>
             <w:pPr>
@@ -2008,7 +2053,7 @@
         </w:tc>
         <w:tc>
           <w:tcPr>
-            <w:tcW w:type="dxa" w:w="2474"/>
+            <w:tcW w:type="dxa" w:w="2427"/>
           </w:tcPr>
           <w:p>
             <w:pPr>
@@ -2026,7 +2071,7 @@
         </w:tc>
         <w:tc>
           <w:tcPr>
-            <w:tcW w:type="dxa" w:w="942"/>
+            <w:tcW w:type="dxa" w:w="924"/>
           </w:tcPr>
           <w:p>
             <w:pPr>
@@ -2044,7 +2089,7 @@
         </w:tc>
         <w:tc>
           <w:tcPr>
-            <w:tcW w:type="dxa" w:w="2179"/>
+            <w:tcW w:type="dxa" w:w="2138"/>
           </w:tcPr>
           <w:p>
             <w:pPr>
@@ -2062,7 +2107,7 @@
         </w:tc>
         <w:tc>
           <w:tcPr>
-            <w:tcW w:type="dxa" w:w="1414"/>
+            <w:tcW w:type="dxa" w:w="1560"/>
           </w:tcPr>
           <w:p>
             <w:pPr>
@@ -2084,7 +2129,7 @@
         </w:trPr>
         <w:tc>
           <w:tcPr>
-            <w:tcW w:type="dxa" w:w="2062"/>
+            <w:tcW w:type="dxa" w:w="2022"/>
           </w:tcPr>
           <w:p>
             <w:pPr>
@@ -2102,7 +2147,7 @@
         </w:tc>
         <w:tc>
           <w:tcPr>
-            <w:tcW w:type="dxa" w:w="2474"/>
+            <w:tcW w:type="dxa" w:w="2427"/>
           </w:tcPr>
           <w:p>
             <w:pPr>
@@ -2120,7 +2165,7 @@
         </w:tc>
         <w:tc>
           <w:tcPr>
-            <w:tcW w:type="dxa" w:w="942"/>
+            <w:tcW w:type="dxa" w:w="924"/>
           </w:tcPr>
           <w:p>
             <w:pPr>
@@ -2138,7 +2183,7 @@
         </w:tc>
         <w:tc>
           <w:tcPr>
-            <w:tcW w:type="dxa" w:w="2179"/>
+            <w:tcW w:type="dxa" w:w="2138"/>
           </w:tcPr>
           <w:p>
             <w:pPr>
@@ -2156,7 +2201,7 @@
         </w:tc>
         <w:tc>
           <w:tcPr>
-            <w:tcW w:type="dxa" w:w="1414"/>
+            <w:tcW w:type="dxa" w:w="1560"/>
           </w:tcPr>
           <w:p>
             <w:pPr>
@@ -2178,7 +2223,7 @@
         </w:trPr>
         <w:tc>
           <w:tcPr>
-            <w:tcW w:type="dxa" w:w="2062"/>
+            <w:tcW w:type="dxa" w:w="2022"/>
           </w:tcPr>
           <w:p>
             <w:pPr>
@@ -2196,7 +2241,7 @@
         </w:tc>
         <w:tc>
           <w:tcPr>
-            <w:tcW w:type="dxa" w:w="2474"/>
+            <w:tcW w:type="dxa" w:w="2427"/>
           </w:tcPr>
           <w:p>
             <w:pPr>
@@ -2214,7 +2259,7 @@
         </w:tc>
         <w:tc>
           <w:tcPr>
-            <w:tcW w:type="dxa" w:w="942"/>
+            <w:tcW w:type="dxa" w:w="924"/>
           </w:tcPr>
           <w:p>
             <w:pPr>
@@ -2232,7 +2277,7 @@
         </w:tc>
         <w:tc>
           <w:tcPr>
-            <w:tcW w:type="dxa" w:w="2179"/>
+            <w:tcW w:type="dxa" w:w="2138"/>
           </w:tcPr>
           <w:p>
             <w:pPr>
@@ -2250,7 +2295,7 @@
         </w:tc>
         <w:tc>
           <w:tcPr>
-            <w:tcW w:type="dxa" w:w="1414"/>
+            <w:tcW w:type="dxa" w:w="1560"/>
           </w:tcPr>
           <w:p>
             <w:pPr>
@@ -2272,7 +2317,7 @@
         </w:trPr>
         <w:tc>
           <w:tcPr>
-            <w:tcW w:type="dxa" w:w="2062"/>
+            <w:tcW w:type="dxa" w:w="2022"/>
           </w:tcPr>
           <w:p>
             <w:pPr>
@@ -2290,7 +2335,7 @@
         </w:tc>
         <w:tc>
           <w:tcPr>
-            <w:tcW w:type="dxa" w:w="2474"/>
+            <w:tcW w:type="dxa" w:w="2427"/>
           </w:tcPr>
           <w:p>
             <w:pPr>
@@ -2308,7 +2353,7 @@
         </w:tc>
         <w:tc>
           <w:tcPr>
-            <w:tcW w:type="dxa" w:w="942"/>
+            <w:tcW w:type="dxa" w:w="924"/>
           </w:tcPr>
           <w:p>
             <w:pPr>
@@ -2326,7 +2371,7 @@
         </w:tc>
         <w:tc>
           <w:tcPr>
-            <w:tcW w:type="dxa" w:w="2179"/>
+            <w:tcW w:type="dxa" w:w="2138"/>
           </w:tcPr>
           <w:p>
             <w:pPr>
@@ -2344,7 +2389,7 @@
         </w:tc>
         <w:tc>
           <w:tcPr>
-            <w:tcW w:type="dxa" w:w="1414"/>
+            <w:tcW w:type="dxa" w:w="1560"/>
           </w:tcPr>
           <w:p>
             <w:pPr>
@@ -2366,7 +2411,7 @@
         </w:trPr>
         <w:tc>
           <w:tcPr>
-            <w:tcW w:type="dxa" w:w="2062"/>
+            <w:tcW w:type="dxa" w:w="2022"/>
           </w:tcPr>
           <w:p>
             <w:pPr>
@@ -2384,7 +2429,7 @@
         </w:tc>
         <w:tc>
           <w:tcPr>
-            <w:tcW w:type="dxa" w:w="2474"/>
+            <w:tcW w:type="dxa" w:w="2427"/>
           </w:tcPr>
           <w:p>
             <w:pPr>
@@ -2402,7 +2447,7 @@
         </w:tc>
         <w:tc>
           <w:tcPr>
-            <w:tcW w:type="dxa" w:w="942"/>
+            <w:tcW w:type="dxa" w:w="924"/>
           </w:tcPr>
           <w:p>
             <w:pPr>
@@ -2420,7 +2465,7 @@
         </w:tc>
         <w:tc>
           <w:tcPr>
-            <w:tcW w:type="dxa" w:w="2179"/>
+            <w:tcW w:type="dxa" w:w="2138"/>
           </w:tcPr>
           <w:p>
             <w:pPr>
@@ -2438,7 +2483,7 @@
         </w:tc>
         <w:tc>
           <w:tcPr>
-            <w:tcW w:type="dxa" w:w="1414"/>
+            <w:tcW w:type="dxa" w:w="1560"/>
           </w:tcPr>
           <w:p>
             <w:pPr>
@@ -2460,7 +2505,7 @@
         </w:trPr>
         <w:tc>
           <w:tcPr>
-            <w:tcW w:type="dxa" w:w="2062"/>
+            <w:tcW w:type="dxa" w:w="2022"/>
           </w:tcPr>
           <w:p>
             <w:pPr>
@@ -2478,7 +2523,7 @@
         </w:tc>
         <w:tc>
           <w:tcPr>
-            <w:tcW w:type="dxa" w:w="2474"/>
+            <w:tcW w:type="dxa" w:w="2427"/>
           </w:tcPr>
           <w:p>
             <w:pPr>
@@ -2496,7 +2541,7 @@
         </w:tc>
         <w:tc>
           <w:tcPr>
-            <w:tcW w:type="dxa" w:w="942"/>
+            <w:tcW w:type="dxa" w:w="924"/>
           </w:tcPr>
           <w:p>
             <w:pPr>
@@ -2514,7 +2559,7 @@
         </w:tc>
         <w:tc>
           <w:tcPr>
-            <w:tcW w:type="dxa" w:w="2179"/>
+            <w:tcW w:type="dxa" w:w="2138"/>
           </w:tcPr>
           <w:p>
             <w:pPr>
@@ -2532,7 +2577,7 @@
         </w:tc>
         <w:tc>
           <w:tcPr>
-            <w:tcW w:type="dxa" w:w="1414"/>
+            <w:tcW w:type="dxa" w:w="1560"/>
           </w:tcPr>
           <w:p>
             <w:pPr>
@@ -2554,7 +2599,7 @@
         </w:trPr>
         <w:tc>
           <w:tcPr>
-            <w:tcW w:type="dxa" w:w="2062"/>
+            <w:tcW w:type="dxa" w:w="2022"/>
           </w:tcPr>
           <w:p>
             <w:pPr>
@@ -2572,7 +2617,7 @@
         </w:tc>
         <w:tc>
           <w:tcPr>
-            <w:tcW w:type="dxa" w:w="2474"/>
+            <w:tcW w:type="dxa" w:w="2427"/>
           </w:tcPr>
           <w:p>
             <w:pPr>
@@ -2590,7 +2635,7 @@
         </w:tc>
         <w:tc>
           <w:tcPr>
-            <w:tcW w:type="dxa" w:w="942"/>
+            <w:tcW w:type="dxa" w:w="924"/>
           </w:tcPr>
           <w:p>
             <w:pPr>
@@ -2608,7 +2653,7 @@
         </w:tc>
         <w:tc>
           <w:tcPr>
-            <w:tcW w:type="dxa" w:w="2179"/>
+            <w:tcW w:type="dxa" w:w="2138"/>
           </w:tcPr>
           <w:p>
             <w:pPr>
@@ -2626,7 +2671,7 @@
         </w:tc>
         <w:tc>
           <w:tcPr>
-            <w:tcW w:type="dxa" w:w="1414"/>
+            <w:tcW w:type="dxa" w:w="1560"/>
           </w:tcPr>
           <w:p>
             <w:pPr>
@@ -2648,7 +2693,7 @@
         </w:trPr>
         <w:tc>
           <w:tcPr>
-            <w:tcW w:type="dxa" w:w="2062"/>
+            <w:tcW w:type="dxa" w:w="2022"/>
           </w:tcPr>
           <w:p>
             <w:pPr>
@@ -2666,7 +2711,7 @@
         </w:tc>
         <w:tc>
           <w:tcPr>
-            <w:tcW w:type="dxa" w:w="2474"/>
+            <w:tcW w:type="dxa" w:w="2427"/>
           </w:tcPr>
           <w:p>
             <w:pPr>
@@ -2684,7 +2729,7 @@
         </w:tc>
         <w:tc>
           <w:tcPr>
-            <w:tcW w:type="dxa" w:w="942"/>
+            <w:tcW w:type="dxa" w:w="924"/>
           </w:tcPr>
           <w:p>
             <w:pPr>
@@ -2702,7 +2747,7 @@
         </w:tc>
         <w:tc>
           <w:tcPr>
-            <w:tcW w:type="dxa" w:w="2179"/>
+            <w:tcW w:type="dxa" w:w="2138"/>
           </w:tcPr>
           <w:p>
             <w:pPr>
@@ -2720,7 +2765,7 @@
         </w:tc>
         <w:tc>
           <w:tcPr>
-            <w:tcW w:type="dxa" w:w="1414"/>
+            <w:tcW w:type="dxa" w:w="1560"/>
           </w:tcPr>
           <w:p>
             <w:pPr>
@@ -2742,7 +2787,7 @@
         </w:trPr>
         <w:tc>
           <w:tcPr>
-            <w:tcW w:type="dxa" w:w="2062"/>
+            <w:tcW w:type="dxa" w:w="2022"/>
           </w:tcPr>
           <w:p>
             <w:pPr>
@@ -2760,7 +2805,7 @@
         </w:tc>
         <w:tc>
           <w:tcPr>
-            <w:tcW w:type="dxa" w:w="2474"/>
+            <w:tcW w:type="dxa" w:w="2427"/>
           </w:tcPr>
           <w:p>
             <w:pPr>
@@ -2778,7 +2823,7 @@
         </w:tc>
         <w:tc>
           <w:tcPr>
-            <w:tcW w:type="dxa" w:w="942"/>
+            <w:tcW w:type="dxa" w:w="924"/>
           </w:tcPr>
           <w:p>
             <w:pPr>
@@ -2796,7 +2841,7 @@
         </w:tc>
         <w:tc>
           <w:tcPr>
-            <w:tcW w:type="dxa" w:w="2179"/>
+            <w:tcW w:type="dxa" w:w="2138"/>
           </w:tcPr>
           <w:p>
             <w:pPr>
@@ -2814,7 +2859,7 @@
         </w:tc>
         <w:tc>
           <w:tcPr>
-            <w:tcW w:type="dxa" w:w="1414"/>
+            <w:tcW w:type="dxa" w:w="1560"/>
           </w:tcPr>
           <w:p>
             <w:pPr>
@@ -3123,7 +3168,7 @@
         </w:trPr>
         <w:tc>
           <w:tcPr>
-            <w:tcW w:type="dxa" w:w="806"/>
+            <w:tcW w:type="dxa" w:w="919"/>
           </w:tcPr>
           <w:p>
             <w:pPr>
@@ -3142,7 +3187,7 @@
         </w:tc>
         <w:tc>
           <w:tcPr>
-            <w:tcW w:type="dxa" w:w="806"/>
+            <w:tcW w:type="dxa" w:w="919"/>
           </w:tcPr>
           <w:p>
             <w:pPr>
@@ -3161,7 +3206,7 @@
         </w:tc>
         <w:tc>
           <w:tcPr>
-            <w:tcW w:type="dxa" w:w="806"/>
+            <w:tcW w:type="dxa" w:w="919"/>
           </w:tcPr>
           <w:p>
             <w:pPr>
@@ -3180,7 +3225,7 @@
         </w:tc>
         <w:tc>
           <w:tcPr>
-            <w:tcW w:type="dxa" w:w="4300"/>
+            <w:tcW w:type="dxa" w:w="3674"/>
           </w:tcPr>
           <w:p>
             <w:pPr>
@@ -3199,7 +3244,7 @@
         </w:tc>
         <w:tc>
           <w:tcPr>
-            <w:tcW w:type="dxa" w:w="1344"/>
+            <w:tcW w:type="dxa" w:w="1550"/>
           </w:tcPr>
           <w:p>
             <w:pPr>
@@ -3218,7 +3263,7 @@
         </w:tc>
         <w:tc>
           <w:tcPr>
-            <w:tcW w:type="dxa" w:w="1008"/>
+            <w:tcW w:type="dxa" w:w="1091"/>
           </w:tcPr>
           <w:p>
             <w:pPr>
@@ -3242,7 +3287,7 @@
         </w:trPr>
         <w:tc>
           <w:tcPr>
-            <w:tcW w:type="dxa" w:w="806"/>
+            <w:tcW w:type="dxa" w:w="919"/>
           </w:tcPr>
           <w:p>
             <w:pPr>
@@ -3260,7 +3305,7 @@
         </w:tc>
         <w:tc>
           <w:tcPr>
-            <w:tcW w:type="dxa" w:w="806"/>
+            <w:tcW w:type="dxa" w:w="919"/>
           </w:tcPr>
           <w:p>
             <w:pPr>
@@ -3278,7 +3323,7 @@
         </w:tc>
         <w:tc>
           <w:tcPr>
-            <w:tcW w:type="dxa" w:w="806"/>
+            <w:tcW w:type="dxa" w:w="919"/>
           </w:tcPr>
           <w:p>
             <w:pPr>
@@ -3296,7 +3341,7 @@
         </w:tc>
         <w:tc>
           <w:tcPr>
-            <w:tcW w:type="dxa" w:w="4300"/>
+            <w:tcW w:type="dxa" w:w="3674"/>
           </w:tcPr>
           <w:p>
             <w:pPr>
@@ -3314,7 +3359,7 @@
         </w:tc>
         <w:tc>
           <w:tcPr>
-            <w:tcW w:type="dxa" w:w="1344"/>
+            <w:tcW w:type="dxa" w:w="1550"/>
           </w:tcPr>
           <w:p>
             <w:pPr>
@@ -3331,7 +3376,7 @@
         </w:tc>
         <w:tc>
           <w:tcPr>
-            <w:tcW w:type="dxa" w:w="1008"/>
+            <w:tcW w:type="dxa" w:w="1091"/>
           </w:tcPr>
           <w:p>
             <w:pPr>
@@ -3353,7 +3398,7 @@
         </w:trPr>
         <w:tc>
           <w:tcPr>
-            <w:tcW w:type="dxa" w:w="806"/>
+            <w:tcW w:type="dxa" w:w="919"/>
           </w:tcPr>
           <w:p>
             <w:pPr>
@@ -3371,7 +3416,7 @@
         </w:tc>
         <w:tc>
           <w:tcPr>
-            <w:tcW w:type="dxa" w:w="806"/>
+            <w:tcW w:type="dxa" w:w="919"/>
           </w:tcPr>
           <w:p>
             <w:pPr>
@@ -3389,7 +3434,7 @@
         </w:tc>
         <w:tc>
           <w:tcPr>
-            <w:tcW w:type="dxa" w:w="806"/>
+            <w:tcW w:type="dxa" w:w="919"/>
           </w:tcPr>
           <w:p>
             <w:pPr>
@@ -3407,7 +3452,7 @@
         </w:tc>
         <w:tc>
           <w:tcPr>
-            <w:tcW w:type="dxa" w:w="4300"/>
+            <w:tcW w:type="dxa" w:w="3674"/>
           </w:tcPr>
           <w:p>
             <w:pPr>
@@ -3425,7 +3470,7 @@
         </w:tc>
         <w:tc>
           <w:tcPr>
-            <w:tcW w:type="dxa" w:w="1344"/>
+            <w:tcW w:type="dxa" w:w="1550"/>
           </w:tcPr>
           <w:p>
             <w:pPr>
@@ -3442,7 +3487,7 @@
         </w:tc>
         <w:tc>
           <w:tcPr>
-            <w:tcW w:type="dxa" w:w="1008"/>
+            <w:tcW w:type="dxa" w:w="1091"/>
           </w:tcPr>
           <w:p>
             <w:pPr>
@@ -3464,7 +3509,7 @@
         </w:trPr>
         <w:tc>
           <w:tcPr>
-            <w:tcW w:type="dxa" w:w="806"/>
+            <w:tcW w:type="dxa" w:w="919"/>
           </w:tcPr>
           <w:p>
             <w:pPr>
@@ -3482,7 +3527,7 @@
         </w:tc>
         <w:tc>
           <w:tcPr>
-            <w:tcW w:type="dxa" w:w="806"/>
+            <w:tcW w:type="dxa" w:w="919"/>
           </w:tcPr>
           <w:p>
             <w:pPr>
@@ -3500,7 +3545,7 @@
         </w:tc>
         <w:tc>
           <w:tcPr>
-            <w:tcW w:type="dxa" w:w="806"/>
+            <w:tcW w:type="dxa" w:w="919"/>
           </w:tcPr>
           <w:p>
             <w:pPr>
@@ -3518,7 +3563,7 @@
         </w:tc>
         <w:tc>
           <w:tcPr>
-            <w:tcW w:type="dxa" w:w="4300"/>
+            <w:tcW w:type="dxa" w:w="3674"/>
           </w:tcPr>
           <w:p>
             <w:pPr>
@@ -3536,7 +3581,7 @@
         </w:tc>
         <w:tc>
           <w:tcPr>
-            <w:tcW w:type="dxa" w:w="1344"/>
+            <w:tcW w:type="dxa" w:w="1550"/>
           </w:tcPr>
           <w:p>
             <w:pPr>
@@ -3553,7 +3598,7 @@
         </w:tc>
         <w:tc>
           <w:tcPr>
-            <w:tcW w:type="dxa" w:w="1008"/>
+            <w:tcW w:type="dxa" w:w="1091"/>
           </w:tcPr>
           <w:p>
             <w:pPr>
@@ -3575,7 +3620,7 @@
         </w:trPr>
         <w:tc>
           <w:tcPr>
-            <w:tcW w:type="dxa" w:w="806"/>
+            <w:tcW w:type="dxa" w:w="919"/>
           </w:tcPr>
           <w:p>
             <w:pPr>
@@ -3593,7 +3638,7 @@
         </w:tc>
         <w:tc>
           <w:tcPr>
-            <w:tcW w:type="dxa" w:w="806"/>
+            <w:tcW w:type="dxa" w:w="919"/>
           </w:tcPr>
           <w:p>
             <w:pPr>
@@ -3611,7 +3656,7 @@
         </w:tc>
         <w:tc>
           <w:tcPr>
-            <w:tcW w:type="dxa" w:w="806"/>
+            <w:tcW w:type="dxa" w:w="919"/>
           </w:tcPr>
           <w:p>
             <w:pPr>
@@ -3629,7 +3674,7 @@
         </w:tc>
         <w:tc>
           <w:tcPr>
-            <w:tcW w:type="dxa" w:w="4300"/>
+            <w:tcW w:type="dxa" w:w="3674"/>
           </w:tcPr>
           <w:p>
             <w:pPr>
@@ -3647,7 +3692,7 @@
         </w:tc>
         <w:tc>
           <w:tcPr>
-            <w:tcW w:type="dxa" w:w="1344"/>
+            <w:tcW w:type="dxa" w:w="1550"/>
           </w:tcPr>
           <w:p>
             <w:pPr>
@@ -3664,7 +3709,7 @@
         </w:tc>
         <w:tc>
           <w:tcPr>
-            <w:tcW w:type="dxa" w:w="1008"/>
+            <w:tcW w:type="dxa" w:w="1091"/>
           </w:tcPr>
           <w:p>
             <w:pPr>
@@ -3686,7 +3731,7 @@
         </w:trPr>
         <w:tc>
           <w:tcPr>
-            <w:tcW w:type="dxa" w:w="806"/>
+            <w:tcW w:type="dxa" w:w="919"/>
           </w:tcPr>
           <w:p>
             <w:pPr>
@@ -3704,7 +3749,7 @@
         </w:tc>
         <w:tc>
           <w:tcPr>
-            <w:tcW w:type="dxa" w:w="806"/>
+            <w:tcW w:type="dxa" w:w="919"/>
           </w:tcPr>
           <w:p>
             <w:pPr>
@@ -3722,7 +3767,7 @@
         </w:tc>
         <w:tc>
           <w:tcPr>
-            <w:tcW w:type="dxa" w:w="806"/>
+            <w:tcW w:type="dxa" w:w="919"/>
           </w:tcPr>
           <w:p>
             <w:pPr>
@@ -3740,7 +3785,7 @@
         </w:tc>
         <w:tc>
           <w:tcPr>
-            <w:tcW w:type="dxa" w:w="4300"/>
+            <w:tcW w:type="dxa" w:w="3674"/>
           </w:tcPr>
           <w:p>
             <w:pPr>
@@ -3758,7 +3803,7 @@
         </w:tc>
         <w:tc>
           <w:tcPr>
-            <w:tcW w:type="dxa" w:w="1344"/>
+            <w:tcW w:type="dxa" w:w="1550"/>
           </w:tcPr>
           <w:p>
             <w:pPr>
@@ -3775,7 +3820,7 @@
         </w:tc>
         <w:tc>
           <w:tcPr>
-            <w:tcW w:type="dxa" w:w="1008"/>
+            <w:tcW w:type="dxa" w:w="1091"/>
           </w:tcPr>
           <w:p>
             <w:pPr>
@@ -3797,7 +3842,7 @@
         </w:trPr>
         <w:tc>
           <w:tcPr>
-            <w:tcW w:type="dxa" w:w="806"/>
+            <w:tcW w:type="dxa" w:w="919"/>
           </w:tcPr>
           <w:p>
             <w:pPr>
@@ -3815,7 +3860,7 @@
         </w:tc>
         <w:tc>
           <w:tcPr>
-            <w:tcW w:type="dxa" w:w="806"/>
+            <w:tcW w:type="dxa" w:w="919"/>
           </w:tcPr>
           <w:p>
             <w:pPr>
@@ -3833,7 +3878,7 @@
         </w:tc>
         <w:tc>
           <w:tcPr>
-            <w:tcW w:type="dxa" w:w="806"/>
+            <w:tcW w:type="dxa" w:w="919"/>
           </w:tcPr>
           <w:p>
             <w:pPr>
@@ -3851,7 +3896,7 @@
         </w:tc>
         <w:tc>
           <w:tcPr>
-            <w:tcW w:type="dxa" w:w="4300"/>
+            <w:tcW w:type="dxa" w:w="3674"/>
           </w:tcPr>
           <w:p>
             <w:pPr>
@@ -3869,7 +3914,7 @@
         </w:tc>
         <w:tc>
           <w:tcPr>
-            <w:tcW w:type="dxa" w:w="1344"/>
+            <w:tcW w:type="dxa" w:w="1550"/>
           </w:tcPr>
           <w:p>
             <w:pPr>
@@ -3886,7 +3931,7 @@
         </w:tc>
         <w:tc>
           <w:tcPr>
-            <w:tcW w:type="dxa" w:w="1008"/>
+            <w:tcW w:type="dxa" w:w="1091"/>
           </w:tcPr>
           <w:p>
             <w:pPr>
@@ -3908,7 +3953,7 @@
         </w:trPr>
         <w:tc>
           <w:tcPr>
-            <w:tcW w:type="dxa" w:w="806"/>
+            <w:tcW w:type="dxa" w:w="919"/>
           </w:tcPr>
           <w:p>
             <w:pPr>
@@ -3926,7 +3971,7 @@
         </w:tc>
         <w:tc>
           <w:tcPr>
-            <w:tcW w:type="dxa" w:w="806"/>
+            <w:tcW w:type="dxa" w:w="919"/>
           </w:tcPr>
           <w:p>
             <w:pPr>
@@ -3944,7 +3989,7 @@
         </w:tc>
         <w:tc>
           <w:tcPr>
-            <w:tcW w:type="dxa" w:w="806"/>
+            <w:tcW w:type="dxa" w:w="919"/>
           </w:tcPr>
           <w:p>
             <w:pPr>
@@ -3962,7 +4007,7 @@
         </w:tc>
         <w:tc>
           <w:tcPr>
-            <w:tcW w:type="dxa" w:w="4300"/>
+            <w:tcW w:type="dxa" w:w="3674"/>
           </w:tcPr>
           <w:p>
             <w:pPr>
@@ -3980,7 +4025,7 @@
         </w:tc>
         <w:tc>
           <w:tcPr>
-            <w:tcW w:type="dxa" w:w="1344"/>
+            <w:tcW w:type="dxa" w:w="1550"/>
           </w:tcPr>
           <w:p>
             <w:pPr>
@@ -3997,7 +4042,7 @@
         </w:tc>
         <w:tc>
           <w:tcPr>
-            <w:tcW w:type="dxa" w:w="1008"/>
+            <w:tcW w:type="dxa" w:w="1091"/>
           </w:tcPr>
           <w:p>
             <w:pPr>
@@ -4019,7 +4064,7 @@
         </w:trPr>
         <w:tc>
           <w:tcPr>
-            <w:tcW w:type="dxa" w:w="806"/>
+            <w:tcW w:type="dxa" w:w="919"/>
           </w:tcPr>
           <w:p>
             <w:pPr>
@@ -4037,7 +4082,7 @@
         </w:tc>
         <w:tc>
           <w:tcPr>
-            <w:tcW w:type="dxa" w:w="806"/>
+            <w:tcW w:type="dxa" w:w="919"/>
           </w:tcPr>
           <w:p>
             <w:pPr>
@@ -4055,7 +4100,7 @@
         </w:tc>
         <w:tc>
           <w:tcPr>
-            <w:tcW w:type="dxa" w:w="806"/>
+            <w:tcW w:type="dxa" w:w="919"/>
           </w:tcPr>
           <w:p>
             <w:pPr>
@@ -4073,7 +4118,7 @@
         </w:tc>
         <w:tc>
           <w:tcPr>
-            <w:tcW w:type="dxa" w:w="4300"/>
+            <w:tcW w:type="dxa" w:w="3674"/>
           </w:tcPr>
           <w:p>
             <w:pPr>
@@ -4091,7 +4136,7 @@
         </w:tc>
         <w:tc>
           <w:tcPr>
-            <w:tcW w:type="dxa" w:w="1344"/>
+            <w:tcW w:type="dxa" w:w="1550"/>
           </w:tcPr>
           <w:p>
             <w:pPr>
@@ -4108,7 +4153,7 @@
         </w:tc>
         <w:tc>
           <w:tcPr>
-            <w:tcW w:type="dxa" w:w="1008"/>
+            <w:tcW w:type="dxa" w:w="1091"/>
           </w:tcPr>
           <w:p>
             <w:pPr>
@@ -4130,7 +4175,7 @@
         </w:trPr>
         <w:tc>
           <w:tcPr>
-            <w:tcW w:type="dxa" w:w="806"/>
+            <w:tcW w:type="dxa" w:w="919"/>
           </w:tcPr>
           <w:p>
             <w:pPr>
@@ -4148,7 +4193,7 @@
         </w:tc>
         <w:tc>
           <w:tcPr>
-            <w:tcW w:type="dxa" w:w="806"/>
+            <w:tcW w:type="dxa" w:w="919"/>
           </w:tcPr>
           <w:p>
             <w:pPr>
@@ -4166,7 +4211,7 @@
         </w:tc>
         <w:tc>
           <w:tcPr>
-            <w:tcW w:type="dxa" w:w="806"/>
+            <w:tcW w:type="dxa" w:w="919"/>
           </w:tcPr>
           <w:p>
             <w:pPr>
@@ -4184,7 +4229,7 @@
         </w:tc>
         <w:tc>
           <w:tcPr>
-            <w:tcW w:type="dxa" w:w="4300"/>
+            <w:tcW w:type="dxa" w:w="3674"/>
           </w:tcPr>
           <w:p>
             <w:pPr>
@@ -4202,7 +4247,7 @@
         </w:tc>
         <w:tc>
           <w:tcPr>
-            <w:tcW w:type="dxa" w:w="1344"/>
+            <w:tcW w:type="dxa" w:w="1550"/>
           </w:tcPr>
           <w:p>
             <w:pPr>
@@ -4219,7 +4264,7 @@
         </w:tc>
         <w:tc>
           <w:tcPr>
-            <w:tcW w:type="dxa" w:w="1008"/>
+            <w:tcW w:type="dxa" w:w="1091"/>
           </w:tcPr>
           <w:p>
             <w:pPr>
@@ -4241,7 +4286,7 @@
         </w:trPr>
         <w:tc>
           <w:tcPr>
-            <w:tcW w:type="dxa" w:w="806"/>
+            <w:tcW w:type="dxa" w:w="919"/>
           </w:tcPr>
           <w:p>
             <w:pPr>
@@ -4259,7 +4304,7 @@
         </w:tc>
         <w:tc>
           <w:tcPr>
-            <w:tcW w:type="dxa" w:w="806"/>
+            <w:tcW w:type="dxa" w:w="919"/>
           </w:tcPr>
           <w:p>
             <w:pPr>
@@ -4277,7 +4322,7 @@
         </w:tc>
         <w:tc>
           <w:tcPr>
-            <w:tcW w:type="dxa" w:w="806"/>
+            <w:tcW w:type="dxa" w:w="919"/>
           </w:tcPr>
           <w:p>
             <w:pPr>
@@ -4295,7 +4340,7 @@
         </w:tc>
         <w:tc>
           <w:tcPr>
-            <w:tcW w:type="dxa" w:w="4300"/>
+            <w:tcW w:type="dxa" w:w="3674"/>
           </w:tcPr>
           <w:p>
             <w:pPr>
@@ -4313,7 +4358,7 @@
         </w:tc>
         <w:tc>
           <w:tcPr>
-            <w:tcW w:type="dxa" w:w="1344"/>
+            <w:tcW w:type="dxa" w:w="1550"/>
           </w:tcPr>
           <w:p>
             <w:pPr>
@@ -4330,7 +4375,7 @@
         </w:tc>
         <w:tc>
           <w:tcPr>
-            <w:tcW w:type="dxa" w:w="1008"/>
+            <w:tcW w:type="dxa" w:w="1091"/>
           </w:tcPr>
           <w:p>
             <w:pPr>
@@ -4352,7 +4397,7 @@
         </w:trPr>
         <w:tc>
           <w:tcPr>
-            <w:tcW w:type="dxa" w:w="806"/>
+            <w:tcW w:type="dxa" w:w="919"/>
           </w:tcPr>
           <w:p>
             <w:pPr>
@@ -4370,7 +4415,7 @@
         </w:tc>
         <w:tc>
           <w:tcPr>
-            <w:tcW w:type="dxa" w:w="806"/>
+            <w:tcW w:type="dxa" w:w="919"/>
           </w:tcPr>
           <w:p>
             <w:pPr>
@@ -4388,7 +4433,7 @@
         </w:tc>
         <w:tc>
           <w:tcPr>
-            <w:tcW w:type="dxa" w:w="806"/>
+            <w:tcW w:type="dxa" w:w="919"/>
           </w:tcPr>
           <w:p>
             <w:pPr>
@@ -4406,7 +4451,7 @@
         </w:tc>
         <w:tc>
           <w:tcPr>
-            <w:tcW w:type="dxa" w:w="4300"/>
+            <w:tcW w:type="dxa" w:w="3674"/>
           </w:tcPr>
           <w:p>
             <w:pPr>
@@ -4424,7 +4469,7 @@
         </w:tc>
         <w:tc>
           <w:tcPr>
-            <w:tcW w:type="dxa" w:w="1344"/>
+            <w:tcW w:type="dxa" w:w="1550"/>
           </w:tcPr>
           <w:p>
             <w:pPr>
@@ -4441,7 +4486,7 @@
         </w:tc>
         <w:tc>
           <w:tcPr>
-            <w:tcW w:type="dxa" w:w="1008"/>
+            <w:tcW w:type="dxa" w:w="1091"/>
           </w:tcPr>
           <w:p>
             <w:pPr>
@@ -4463,7 +4508,7 @@
         </w:trPr>
         <w:tc>
           <w:tcPr>
-            <w:tcW w:type="dxa" w:w="806"/>
+            <w:tcW w:type="dxa" w:w="919"/>
           </w:tcPr>
           <w:p>
             <w:pPr>
@@ -4481,7 +4526,7 @@
         </w:tc>
         <w:tc>
           <w:tcPr>
-            <w:tcW w:type="dxa" w:w="806"/>
+            <w:tcW w:type="dxa" w:w="919"/>
           </w:tcPr>
           <w:p>
             <w:pPr>
@@ -4499,7 +4544,7 @@
         </w:tc>
         <w:tc>
           <w:tcPr>
-            <w:tcW w:type="dxa" w:w="806"/>
+            <w:tcW w:type="dxa" w:w="919"/>
           </w:tcPr>
           <w:p>
             <w:pPr>
@@ -4517,7 +4562,7 @@
         </w:tc>
         <w:tc>
           <w:tcPr>
-            <w:tcW w:type="dxa" w:w="4300"/>
+            <w:tcW w:type="dxa" w:w="3674"/>
           </w:tcPr>
           <w:p>
             <w:pPr>
@@ -4535,7 +4580,7 @@
         </w:tc>
         <w:tc>
           <w:tcPr>
-            <w:tcW w:type="dxa" w:w="1344"/>
+            <w:tcW w:type="dxa" w:w="1550"/>
           </w:tcPr>
           <w:p>
             <w:pPr>
@@ -4552,7 +4597,7 @@
         </w:tc>
         <w:tc>
           <w:tcPr>
-            <w:tcW w:type="dxa" w:w="1008"/>
+            <w:tcW w:type="dxa" w:w="1091"/>
           </w:tcPr>
           <w:p>
             <w:pPr>
@@ -4959,7 +5004,7 @@
         </w:trPr>
         <w:tc>
           <w:tcPr>
-            <w:tcW w:type="dxa" w:w="2347"/>
+            <w:tcW w:type="dxa" w:w="2223"/>
           </w:tcPr>
           <w:p>
             <w:pPr>
@@ -4978,7 +5023,7 @@
         </w:tc>
         <w:tc>
           <w:tcPr>
-            <w:tcW w:type="dxa" w:w="1459"/>
+            <w:tcW w:type="dxa" w:w="1382"/>
           </w:tcPr>
           <w:p>
             <w:pPr>
@@ -4997,7 +5042,7 @@
         </w:tc>
         <w:tc>
           <w:tcPr>
-            <w:tcW w:type="dxa" w:w="951"/>
+            <w:tcW w:type="dxa" w:w="1141"/>
           </w:tcPr>
           <w:p>
             <w:pPr>
@@ -5016,7 +5061,7 @@
         </w:tc>
         <w:tc>
           <w:tcPr>
-            <w:tcW w:type="dxa" w:w="3425"/>
+            <w:tcW w:type="dxa" w:w="3244"/>
           </w:tcPr>
           <w:p>
             <w:pPr>
@@ -5035,7 +5080,7 @@
         </w:tc>
         <w:tc>
           <w:tcPr>
-            <w:tcW w:type="dxa" w:w="888"/>
+            <w:tcW w:type="dxa" w:w="1081"/>
           </w:tcPr>
           <w:p>
             <w:pPr>
@@ -5059,7 +5104,7 @@
         </w:trPr>
         <w:tc>
           <w:tcPr>
-            <w:tcW w:type="dxa" w:w="2347"/>
+            <w:tcW w:type="dxa" w:w="2223"/>
           </w:tcPr>
           <w:p>
             <w:pPr>
@@ -5077,7 +5122,7 @@
         </w:tc>
         <w:tc>
           <w:tcPr>
-            <w:tcW w:type="dxa" w:w="1459"/>
+            <w:tcW w:type="dxa" w:w="1382"/>
           </w:tcPr>
           <w:p>
             <w:pPr>
@@ -5095,7 +5140,7 @@
         </w:tc>
         <w:tc>
           <w:tcPr>
-            <w:tcW w:type="dxa" w:w="951"/>
+            <w:tcW w:type="dxa" w:w="1141"/>
           </w:tcPr>
           <w:p>
             <w:pPr>
@@ -5112,7 +5157,7 @@
         </w:tc>
         <w:tc>
           <w:tcPr>
-            <w:tcW w:type="dxa" w:w="3425"/>
+            <w:tcW w:type="dxa" w:w="3244"/>
           </w:tcPr>
           <w:p>
             <w:pPr>
@@ -5130,7 +5175,7 @@
         </w:tc>
         <w:tc>
           <w:tcPr>
-            <w:tcW w:type="dxa" w:w="888"/>
+            <w:tcW w:type="dxa" w:w="1081"/>
           </w:tcPr>
           <w:p>
             <w:pPr>
@@ -5152,7 +5197,7 @@
         </w:trPr>
         <w:tc>
           <w:tcPr>
-            <w:tcW w:type="dxa" w:w="2347"/>
+            <w:tcW w:type="dxa" w:w="2223"/>
           </w:tcPr>
           <w:p>
             <w:pPr>
@@ -5170,7 +5215,7 @@
         </w:tc>
         <w:tc>
           <w:tcPr>
-            <w:tcW w:type="dxa" w:w="1459"/>
+            <w:tcW w:type="dxa" w:w="1382"/>
           </w:tcPr>
           <w:p>
             <w:pPr>
@@ -5188,7 +5233,7 @@
         </w:tc>
         <w:tc>
           <w:tcPr>
-            <w:tcW w:type="dxa" w:w="951"/>
+            <w:tcW w:type="dxa" w:w="1141"/>
           </w:tcPr>
           <w:p>
             <w:pPr>
@@ -5205,7 +5250,7 @@
         </w:tc>
         <w:tc>
           <w:tcPr>
-            <w:tcW w:type="dxa" w:w="3425"/>
+            <w:tcW w:type="dxa" w:w="3244"/>
           </w:tcPr>
           <w:p>
             <w:pPr>
@@ -5223,7 +5268,7 @@
         </w:tc>
         <w:tc>
           <w:tcPr>
-            <w:tcW w:type="dxa" w:w="888"/>
+            <w:tcW w:type="dxa" w:w="1081"/>
           </w:tcPr>
           <w:p>
             <w:pPr>
@@ -5245,7 +5290,7 @@
         </w:trPr>
         <w:tc>
           <w:tcPr>
-            <w:tcW w:type="dxa" w:w="2347"/>
+            <w:tcW w:type="dxa" w:w="2223"/>
           </w:tcPr>
           <w:p>
             <w:pPr>
@@ -5263,7 +5308,7 @@
         </w:tc>
         <w:tc>
           <w:tcPr>
-            <w:tcW w:type="dxa" w:w="1459"/>
+            <w:tcW w:type="dxa" w:w="1382"/>
           </w:tcPr>
           <w:p>
             <w:pPr>
@@ -5281,7 +5326,7 @@
         </w:tc>
         <w:tc>
           <w:tcPr>
-            <w:tcW w:type="dxa" w:w="951"/>
+            <w:tcW w:type="dxa" w:w="1141"/>
           </w:tcPr>
           <w:p>
             <w:pPr>
@@ -5298,7 +5343,7 @@
         </w:tc>
         <w:tc>
           <w:tcPr>
-            <w:tcW w:type="dxa" w:w="3425"/>
+            <w:tcW w:type="dxa" w:w="3244"/>
           </w:tcPr>
           <w:p>
             <w:pPr>
@@ -5316,7 +5361,7 @@
         </w:tc>
         <w:tc>
           <w:tcPr>
-            <w:tcW w:type="dxa" w:w="888"/>
+            <w:tcW w:type="dxa" w:w="1081"/>
           </w:tcPr>
           <w:p>
             <w:pPr>
@@ -5338,7 +5383,7 @@
         </w:trPr>
         <w:tc>
           <w:tcPr>
-            <w:tcW w:type="dxa" w:w="2347"/>
+            <w:tcW w:type="dxa" w:w="2223"/>
           </w:tcPr>
           <w:p>
             <w:pPr>
@@ -5356,7 +5401,7 @@
         </w:tc>
         <w:tc>
           <w:tcPr>
-            <w:tcW w:type="dxa" w:w="1459"/>
+            <w:tcW w:type="dxa" w:w="1382"/>
           </w:tcPr>
           <w:p>
             <w:pPr>
@@ -5374,7 +5419,7 @@
         </w:tc>
         <w:tc>
           <w:tcPr>
-            <w:tcW w:type="dxa" w:w="951"/>
+            <w:tcW w:type="dxa" w:w="1141"/>
           </w:tcPr>
           <w:p>
             <w:pPr>
@@ -5392,7 +5437,7 @@
         </w:tc>
         <w:tc>
           <w:tcPr>
-            <w:tcW w:type="dxa" w:w="3425"/>
+            <w:tcW w:type="dxa" w:w="3244"/>
           </w:tcPr>
           <w:p>
             <w:pPr>
@@ -5410,7 +5455,7 @@
         </w:tc>
         <w:tc>
           <w:tcPr>
-            <w:tcW w:type="dxa" w:w="888"/>
+            <w:tcW w:type="dxa" w:w="1081"/>
           </w:tcPr>
           <w:p>
             <w:pPr>
@@ -5433,7 +5478,7 @@
         </w:trPr>
         <w:tc>
           <w:tcPr>
-            <w:tcW w:type="dxa" w:w="2347"/>
+            <w:tcW w:type="dxa" w:w="2223"/>
           </w:tcPr>
           <w:p>
             <w:pPr>
@@ -5451,7 +5496,7 @@
         </w:tc>
         <w:tc>
           <w:tcPr>
-            <w:tcW w:type="dxa" w:w="1459"/>
+            <w:tcW w:type="dxa" w:w="1382"/>
           </w:tcPr>
           <w:p>
             <w:pPr>
@@ -5469,7 +5514,7 @@
         </w:tc>
         <w:tc>
           <w:tcPr>
-            <w:tcW w:type="dxa" w:w="951"/>
+            <w:tcW w:type="dxa" w:w="1141"/>
           </w:tcPr>
           <w:p>
             <w:pPr>
@@ -5486,7 +5531,7 @@
         </w:tc>
         <w:tc>
           <w:tcPr>
-            <w:tcW w:type="dxa" w:w="3425"/>
+            <w:tcW w:type="dxa" w:w="3244"/>
           </w:tcPr>
           <w:p>
             <w:pPr>
@@ -5504,7 +5549,7 @@
         </w:tc>
         <w:tc>
           <w:tcPr>
-            <w:tcW w:type="dxa" w:w="888"/>
+            <w:tcW w:type="dxa" w:w="1081"/>
           </w:tcPr>
           <w:p>
             <w:pPr>
@@ -5526,7 +5571,7 @@
         </w:trPr>
         <w:tc>
           <w:tcPr>
-            <w:tcW w:type="dxa" w:w="2347"/>
+            <w:tcW w:type="dxa" w:w="2223"/>
           </w:tcPr>
           <w:p>
             <w:pPr>
@@ -5544,7 +5589,7 @@
         </w:tc>
         <w:tc>
           <w:tcPr>
-            <w:tcW w:type="dxa" w:w="1459"/>
+            <w:tcW w:type="dxa" w:w="1382"/>
           </w:tcPr>
           <w:p>
             <w:pPr>
@@ -5562,7 +5607,7 @@
         </w:tc>
         <w:tc>
           <w:tcPr>
-            <w:tcW w:type="dxa" w:w="951"/>
+            <w:tcW w:type="dxa" w:w="1141"/>
           </w:tcPr>
           <w:p>
             <w:pPr>
@@ -5579,7 +5624,7 @@
         </w:tc>
         <w:tc>
           <w:tcPr>
-            <w:tcW w:type="dxa" w:w="3425"/>
+            <w:tcW w:type="dxa" w:w="3244"/>
           </w:tcPr>
           <w:p>
             <w:pPr>
@@ -5597,7 +5642,7 @@
         </w:tc>
         <w:tc>
           <w:tcPr>
-            <w:tcW w:type="dxa" w:w="888"/>
+            <w:tcW w:type="dxa" w:w="1081"/>
           </w:tcPr>
           <w:p>
             <w:pPr>
@@ -5619,7 +5664,7 @@
         </w:trPr>
         <w:tc>
           <w:tcPr>
-            <w:tcW w:type="dxa" w:w="2347"/>
+            <w:tcW w:type="dxa" w:w="2223"/>
           </w:tcPr>
           <w:p>
             <w:pPr>
@@ -5637,7 +5682,7 @@
         </w:tc>
         <w:tc>
           <w:tcPr>
-            <w:tcW w:type="dxa" w:w="1459"/>
+            <w:tcW w:type="dxa" w:w="1382"/>
           </w:tcPr>
           <w:p>
             <w:pPr>
@@ -5655,7 +5700,7 @@
         </w:tc>
         <w:tc>
           <w:tcPr>
-            <w:tcW w:type="dxa" w:w="951"/>
+            <w:tcW w:type="dxa" w:w="1141"/>
           </w:tcPr>
           <w:p>
             <w:pPr>
@@ -5672,7 +5717,7 @@
         </w:tc>
         <w:tc>
           <w:tcPr>
-            <w:tcW w:type="dxa" w:w="3425"/>
+            <w:tcW w:type="dxa" w:w="3244"/>
           </w:tcPr>
           <w:p>
             <w:pPr>
@@ -5690,7 +5735,7 @@
         </w:tc>
         <w:tc>
           <w:tcPr>
-            <w:tcW w:type="dxa" w:w="888"/>
+            <w:tcW w:type="dxa" w:w="1081"/>
           </w:tcPr>
           <w:p>
             <w:pPr>
@@ -5775,7 +5820,7 @@
         </w:trPr>
         <w:tc>
           <w:tcPr>
-            <w:tcW w:type="dxa" w:w="2875"/>
+            <w:tcW w:type="dxa" w:w="2685"/>
           </w:tcPr>
           <w:p>
             <w:pPr>
@@ -5794,7 +5839,7 @@
         </w:tc>
         <w:tc>
           <w:tcPr>
-            <w:tcW w:type="dxa" w:w="4088"/>
+            <w:tcW w:type="dxa" w:w="3819"/>
           </w:tcPr>
           <w:p>
             <w:pPr>
@@ -5813,7 +5858,7 @@
         </w:tc>
         <w:tc>
           <w:tcPr>
-            <w:tcW w:type="dxa" w:w="1150"/>
+            <w:tcW w:type="dxa" w:w="1432"/>
           </w:tcPr>
           <w:p>
             <w:pPr>
@@ -5832,7 +5877,7 @@
         </w:tc>
         <w:tc>
           <w:tcPr>
-            <w:tcW w:type="dxa" w:w="958"/>
+            <w:tcW w:type="dxa" w:w="1134"/>
           </w:tcPr>
           <w:p>
             <w:pPr>
@@ -5856,7 +5901,7 @@
         </w:trPr>
         <w:tc>
           <w:tcPr>
-            <w:tcW w:type="dxa" w:w="2875"/>
+            <w:tcW w:type="dxa" w:w="2685"/>
           </w:tcPr>
           <w:p>
             <w:pPr>
@@ -5874,7 +5919,7 @@
         </w:tc>
         <w:tc>
           <w:tcPr>
-            <w:tcW w:type="dxa" w:w="4088"/>
+            <w:tcW w:type="dxa" w:w="3819"/>
           </w:tcPr>
           <w:p>
             <w:pPr>
@@ -5892,7 +5937,7 @@
         </w:tc>
         <w:tc>
           <w:tcPr>
-            <w:tcW w:type="dxa" w:w="1150"/>
+            <w:tcW w:type="dxa" w:w="1432"/>
           </w:tcPr>
           <w:p>
             <w:pPr>
@@ -5909,7 +5954,7 @@
         </w:tc>
         <w:tc>
           <w:tcPr>
-            <w:tcW w:type="dxa" w:w="958"/>
+            <w:tcW w:type="dxa" w:w="1134"/>
           </w:tcPr>
           <w:p>
             <w:pPr>
@@ -5931,7 +5976,7 @@
         </w:trPr>
         <w:tc>
           <w:tcPr>
-            <w:tcW w:type="dxa" w:w="2875"/>
+            <w:tcW w:type="dxa" w:w="2685"/>
           </w:tcPr>
           <w:p>
             <w:pPr>
@@ -5949,7 +5994,7 @@
         </w:tc>
         <w:tc>
           <w:tcPr>
-            <w:tcW w:type="dxa" w:w="4088"/>
+            <w:tcW w:type="dxa" w:w="3819"/>
           </w:tcPr>
           <w:p>
             <w:pPr>
@@ -5967,7 +6012,7 @@
         </w:tc>
         <w:tc>
           <w:tcPr>
-            <w:tcW w:type="dxa" w:w="1150"/>
+            <w:tcW w:type="dxa" w:w="1432"/>
           </w:tcPr>
           <w:p>
             <w:pPr>
@@ -5984,7 +6029,7 @@
         </w:tc>
         <w:tc>
           <w:tcPr>
-            <w:tcW w:type="dxa" w:w="958"/>
+            <w:tcW w:type="dxa" w:w="1134"/>
           </w:tcPr>
           <w:p>
             <w:pPr>
@@ -6006,7 +6051,7 @@
         </w:trPr>
         <w:tc>
           <w:tcPr>
-            <w:tcW w:type="dxa" w:w="2875"/>
+            <w:tcW w:type="dxa" w:w="2685"/>
           </w:tcPr>
           <w:p>
             <w:pPr>
@@ -6024,7 +6069,7 @@
         </w:tc>
         <w:tc>
           <w:tcPr>
-            <w:tcW w:type="dxa" w:w="4088"/>
+            <w:tcW w:type="dxa" w:w="3819"/>
           </w:tcPr>
           <w:p>
             <w:pPr>
@@ -6042,7 +6087,7 @@
         </w:tc>
         <w:tc>
           <w:tcPr>
-            <w:tcW w:type="dxa" w:w="1150"/>
+            <w:tcW w:type="dxa" w:w="1432"/>
           </w:tcPr>
           <w:p>
             <w:pPr>
@@ -6059,7 +6104,7 @@
         </w:tc>
         <w:tc>
           <w:tcPr>
-            <w:tcW w:type="dxa" w:w="958"/>
+            <w:tcW w:type="dxa" w:w="1134"/>
           </w:tcPr>
           <w:p>
             <w:pPr>
@@ -6081,7 +6126,7 @@
         </w:trPr>
         <w:tc>
           <w:tcPr>
-            <w:tcW w:type="dxa" w:w="2875"/>
+            <w:tcW w:type="dxa" w:w="2685"/>
           </w:tcPr>
           <w:p>
             <w:pPr>
@@ -6099,7 +6144,7 @@
         </w:tc>
         <w:tc>
           <w:tcPr>
-            <w:tcW w:type="dxa" w:w="4088"/>
+            <w:tcW w:type="dxa" w:w="3819"/>
           </w:tcPr>
           <w:p>
             <w:pPr>
@@ -6117,7 +6162,7 @@
         </w:tc>
         <w:tc>
           <w:tcPr>
-            <w:tcW w:type="dxa" w:w="1150"/>
+            <w:tcW w:type="dxa" w:w="1432"/>
           </w:tcPr>
           <w:p>
             <w:pPr>
@@ -6134,7 +6179,7 @@
         </w:tc>
         <w:tc>
           <w:tcPr>
-            <w:tcW w:type="dxa" w:w="958"/>
+            <w:tcW w:type="dxa" w:w="1134"/>
           </w:tcPr>
           <w:p>
             <w:pPr>
@@ -6183,11 +6228,667 @@
     </w:p>
     <w:p>
       <w:r>
-        <w:rPr>
-          <w:i/>
-          <w:color w:val="808080"/>
-        </w:rPr>
-        <w:t>Qué haría falta para pasar del prototipo a la operación: servidor en la nube en vez de la laptop del rol 3 (el punto único de falla de todo el proyecto), pasarela de pago real, dominio rutamoto.gt con certificado, correo real en vez de Mailpit, encuesta postventa para medir el CSAT, BI con histórico (Power BI o Looker Studio sobre réplica de PostgreSQL), la expansión a Sacatepéquez, Chimaltenango y Escuintla. Con costo estimado donde se pueda.</w:t>
+        <w:t>La Fase 3 deja un prototipo funcional: el ciclo comercial completo opera sobre una sola instancia de Odoo. Para que RutaMoto pase a operar como empresa hacen falta cambios de infraestructura, de servicios y de medición, que se ordenan aquí por prioridad. Los costos son los del presupuesto preoperativo de la Fase 1, que ya contemplaba la operación real; lo que no figura en ese presupuesto se indica como tal y no se estima.</w:t>
+      </w:r>
+    </w:p>
+    <w:p>
+      <w:pPr>
+        <w:keepNext/>
+        <w:jc w:val="center"/>
+      </w:pPr>
+      <w:r>
+        <w:t>Tabla __. Propuesta de escalabilidad, por prioridad. Elaboración propia.</w:t>
+      </w:r>
+    </w:p>
+    <w:tbl>
+      <w:tblPr>
+        <w:tblStyle w:val="Tablaconcuadrcula"/>
+        <w:tblW w:type="auto" w:w="0"/>
+        <w:tblLayout w:type="fixed"/>
+        <w:tblLook w:firstColumn="1" w:firstRow="1" w:lastColumn="0" w:lastRow="0" w:noHBand="0" w:noVBand="1" w:val="04A0"/>
+      </w:tblPr>
+      <w:tblGrid>
+        <w:gridCol w:w="2313"/>
+        <w:gridCol w:w="2313"/>
+        <w:gridCol w:w="2313"/>
+        <w:gridCol w:w="2313"/>
+      </w:tblGrid>
+      <w:tr>
+        <w:trPr>
+          <w:cantSplit/>
+          <w:tblHeader w:val="true"/>
+        </w:trPr>
+        <w:tc>
+          <w:tcPr>
+            <w:tcW w:type="dxa" w:w="698"/>
+          </w:tcPr>
+          <w:p>
+            <w:pPr>
+              <w:keepNext/>
+              <w:spacing w:after="0" w:line="240" w:lineRule="auto"/>
+              <w:jc w:val="left"/>
+            </w:pPr>
+            <w:r>
+              <w:rPr>
+                <w:b/>
+                <w:sz w:val="20"/>
+              </w:rPr>
+              <w:t>#</w:t>
+            </w:r>
+          </w:p>
+        </w:tc>
+        <w:tc>
+          <w:tcPr>
+            <w:tcW w:type="dxa" w:w="2791"/>
+          </w:tcPr>
+          <w:p>
+            <w:pPr>
+              <w:keepNext/>
+              <w:spacing w:after="0" w:line="240" w:lineRule="auto"/>
+              <w:jc w:val="left"/>
+            </w:pPr>
+            <w:r>
+              <w:rPr>
+                <w:b/>
+                <w:sz w:val="20"/>
+              </w:rPr>
+              <w:t>Mejora</w:t>
+            </w:r>
+          </w:p>
+        </w:tc>
+        <w:tc>
+          <w:tcPr>
+            <w:tcW w:type="dxa" w:w="2791"/>
+          </w:tcPr>
+          <w:p>
+            <w:pPr>
+              <w:keepNext/>
+              <w:spacing w:after="0" w:line="240" w:lineRule="auto"/>
+              <w:jc w:val="left"/>
+            </w:pPr>
+            <w:r>
+              <w:rPr>
+                <w:b/>
+                <w:sz w:val="20"/>
+              </w:rPr>
+              <w:t>Qué resuelve</w:t>
+            </w:r>
+          </w:p>
+        </w:tc>
+        <w:tc>
+          <w:tcPr>
+            <w:tcW w:type="dxa" w:w="2791"/>
+          </w:tcPr>
+          <w:p>
+            <w:pPr>
+              <w:keepNext/>
+              <w:spacing w:after="0" w:line="240" w:lineRule="auto"/>
+              <w:jc w:val="left"/>
+            </w:pPr>
+            <w:r>
+              <w:rPr>
+                <w:b/>
+                <w:sz w:val="20"/>
+              </w:rPr>
+              <w:t>Costo (presupuesto de la Fase 1)</w:t>
+            </w:r>
+          </w:p>
+        </w:tc>
+      </w:tr>
+      <w:tr>
+        <w:trPr>
+          <w:cantSplit/>
+        </w:trPr>
+        <w:tc>
+          <w:tcPr>
+            <w:tcW w:type="dxa" w:w="698"/>
+          </w:tcPr>
+          <w:p>
+            <w:pPr>
+              <w:keepNext/>
+              <w:spacing w:after="0" w:line="240" w:lineRule="auto"/>
+              <w:jc w:val="left"/>
+            </w:pPr>
+            <w:r>
+              <w:rPr>
+                <w:sz w:val="20"/>
+              </w:rPr>
+              <w:t>1</w:t>
+            </w:r>
+          </w:p>
+        </w:tc>
+        <w:tc>
+          <w:tcPr>
+            <w:tcW w:type="dxa" w:w="2791"/>
+          </w:tcPr>
+          <w:p>
+            <w:pPr>
+              <w:keepNext/>
+              <w:spacing w:after="0" w:line="240" w:lineRule="auto"/>
+              <w:jc w:val="left"/>
+            </w:pPr>
+            <w:r>
+              <w:rPr>
+                <w:sz w:val="20"/>
+              </w:rPr>
+              <w:t>Servidor virtual en la nube (4 vCPU, 8 GB de RAM, 80 GB SSD) con respaldo de 100 GB</w:t>
+            </w:r>
+          </w:p>
+        </w:tc>
+        <w:tc>
+          <w:tcPr>
+            <w:tcW w:type="dxa" w:w="2791"/>
+          </w:tcPr>
+          <w:p>
+            <w:pPr>
+              <w:keepNext/>
+              <w:spacing w:after="0" w:line="240" w:lineRule="auto"/>
+              <w:jc w:val="left"/>
+            </w:pPr>
+            <w:r>
+              <w:rPr>
+                <w:sz w:val="20"/>
+              </w:rPr>
+              <w:t>El punto único de falla del proyecto: hoy toda la operación depende de que un equipo portátil esté encendido</w:t>
+            </w:r>
+          </w:p>
+        </w:tc>
+        <w:tc>
+          <w:tcPr>
+            <w:tcW w:type="dxa" w:w="2791"/>
+          </w:tcPr>
+          <w:p>
+            <w:pPr>
+              <w:keepNext/>
+              <w:spacing w:after="0" w:line="240" w:lineRule="auto"/>
+              <w:jc w:val="left"/>
+            </w:pPr>
+            <w:r>
+              <w:rPr>
+                <w:sz w:val="20"/>
+              </w:rPr>
+              <w:t>Q 2,400 al año el servidor. El respaldo no tiene rubro propio</w:t>
+            </w:r>
+          </w:p>
+        </w:tc>
+      </w:tr>
+      <w:tr>
+        <w:trPr>
+          <w:cantSplit/>
+        </w:trPr>
+        <w:tc>
+          <w:tcPr>
+            <w:tcW w:type="dxa" w:w="698"/>
+          </w:tcPr>
+          <w:p>
+            <w:pPr>
+              <w:keepNext/>
+              <w:spacing w:after="0" w:line="240" w:lineRule="auto"/>
+              <w:jc w:val="left"/>
+            </w:pPr>
+            <w:r>
+              <w:rPr>
+                <w:sz w:val="20"/>
+              </w:rPr>
+              <w:t>2</w:t>
+            </w:r>
+          </w:p>
+        </w:tc>
+        <w:tc>
+          <w:tcPr>
+            <w:tcW w:type="dxa" w:w="2791"/>
+          </w:tcPr>
+          <w:p>
+            <w:pPr>
+              <w:keepNext/>
+              <w:spacing w:after="0" w:line="240" w:lineRule="auto"/>
+              <w:jc w:val="left"/>
+            </w:pPr>
+            <w:r>
+              <w:rPr>
+                <w:sz w:val="20"/>
+              </w:rPr>
+              <w:t>Dominio rutamoto.gt con HTTPS (Nginx y certificado de Let's Encrypt)</w:t>
+            </w:r>
+          </w:p>
+        </w:tc>
+        <w:tc>
+          <w:tcPr>
+            <w:tcW w:type="dxa" w:w="2791"/>
+          </w:tcPr>
+          <w:p>
+            <w:pPr>
+              <w:keepNext/>
+              <w:spacing w:after="0" w:line="240" w:lineRule="auto"/>
+              <w:jc w:val="left"/>
+            </w:pPr>
+            <w:r>
+              <w:rPr>
+                <w:sz w:val="20"/>
+              </w:rPr>
+              <w:t>Reemplaza la dirección temporal del acceso remoto, que cambia en cada reinicio. El certificado es requisito para cobrar en línea</w:t>
+            </w:r>
+          </w:p>
+        </w:tc>
+        <w:tc>
+          <w:tcPr>
+            <w:tcW w:type="dxa" w:w="2791"/>
+          </w:tcPr>
+          <w:p>
+            <w:pPr>
+              <w:keepNext/>
+              <w:spacing w:after="0" w:line="240" w:lineRule="auto"/>
+              <w:jc w:val="left"/>
+            </w:pPr>
+            <w:r>
+              <w:rPr>
+                <w:sz w:val="20"/>
+              </w:rPr>
+              <w:t>Q 700 al año el dominio; el certificado, Q 0</w:t>
+            </w:r>
+          </w:p>
+        </w:tc>
+      </w:tr>
+      <w:tr>
+        <w:trPr>
+          <w:cantSplit/>
+        </w:trPr>
+        <w:tc>
+          <w:tcPr>
+            <w:tcW w:type="dxa" w:w="698"/>
+          </w:tcPr>
+          <w:p>
+            <w:pPr>
+              <w:keepNext/>
+              <w:spacing w:after="0" w:line="240" w:lineRule="auto"/>
+              <w:jc w:val="left"/>
+            </w:pPr>
+            <w:r>
+              <w:rPr>
+                <w:sz w:val="20"/>
+              </w:rPr>
+              <w:t>3</w:t>
+            </w:r>
+          </w:p>
+        </w:tc>
+        <w:tc>
+          <w:tcPr>
+            <w:tcW w:type="dxa" w:w="2791"/>
+          </w:tcPr>
+          <w:p>
+            <w:pPr>
+              <w:keepNext/>
+              <w:spacing w:after="0" w:line="240" w:lineRule="auto"/>
+              <w:jc w:val="left"/>
+            </w:pPr>
+            <w:r>
+              <w:rPr>
+                <w:sz w:val="20"/>
+              </w:rPr>
+              <w:t>Pasarela de pago real</w:t>
+            </w:r>
+          </w:p>
+        </w:tc>
+        <w:tc>
+          <w:tcPr>
+            <w:tcW w:type="dxa" w:w="2791"/>
+          </w:tcPr>
+          <w:p>
+            <w:pPr>
+              <w:keepNext/>
+              <w:spacing w:after="0" w:line="240" w:lineRule="auto"/>
+              <w:jc w:val="left"/>
+            </w:pPr>
+            <w:r>
+              <w:rPr>
+                <w:sz w:val="20"/>
+              </w:rPr>
+              <w:t>Reemplaza el proveedor de pago de prueba: cobro con tarjeta</w:t>
+            </w:r>
+          </w:p>
+        </w:tc>
+        <w:tc>
+          <w:tcPr>
+            <w:tcW w:type="dxa" w:w="2791"/>
+          </w:tcPr>
+          <w:p>
+            <w:pPr>
+              <w:keepNext/>
+              <w:spacing w:after="0" w:line="240" w:lineRule="auto"/>
+              <w:jc w:val="left"/>
+            </w:pPr>
+            <w:r>
+              <w:rPr>
+                <w:sz w:val="20"/>
+              </w:rPr>
+              <w:t>Q 1,500 de afiliación, más comisión por transacción</w:t>
+            </w:r>
+          </w:p>
+        </w:tc>
+      </w:tr>
+      <w:tr>
+        <w:trPr>
+          <w:cantSplit/>
+        </w:trPr>
+        <w:tc>
+          <w:tcPr>
+            <w:tcW w:type="dxa" w:w="698"/>
+          </w:tcPr>
+          <w:p>
+            <w:pPr>
+              <w:keepNext/>
+              <w:spacing w:after="0" w:line="240" w:lineRule="auto"/>
+              <w:jc w:val="left"/>
+            </w:pPr>
+            <w:r>
+              <w:rPr>
+                <w:sz w:val="20"/>
+              </w:rPr>
+              <w:t>4</w:t>
+            </w:r>
+          </w:p>
+        </w:tc>
+        <w:tc>
+          <w:tcPr>
+            <w:tcW w:type="dxa" w:w="2791"/>
+          </w:tcPr>
+          <w:p>
+            <w:pPr>
+              <w:keepNext/>
+              <w:spacing w:after="0" w:line="240" w:lineRule="auto"/>
+              <w:jc w:val="left"/>
+            </w:pPr>
+            <w:r>
+              <w:rPr>
+                <w:sz w:val="20"/>
+              </w:rPr>
+              <w:t>Servidor de correo saliente real</w:t>
+            </w:r>
+          </w:p>
+        </w:tc>
+        <w:tc>
+          <w:tcPr>
+            <w:tcW w:type="dxa" w:w="2791"/>
+          </w:tcPr>
+          <w:p>
+            <w:pPr>
+              <w:keepNext/>
+              <w:spacing w:after="0" w:line="240" w:lineRule="auto"/>
+              <w:jc w:val="left"/>
+            </w:pPr>
+            <w:r>
+              <w:rPr>
+                <w:sz w:val="20"/>
+              </w:rPr>
+              <w:t>Las cotizaciones y las campañas llegan al buzón del cliente</w:t>
+            </w:r>
+          </w:p>
+        </w:tc>
+        <w:tc>
+          <w:tcPr>
+            <w:tcW w:type="dxa" w:w="2791"/>
+          </w:tcPr>
+          <w:p>
+            <w:pPr>
+              <w:keepNext/>
+              <w:spacing w:after="0" w:line="240" w:lineRule="auto"/>
+              <w:jc w:val="left"/>
+            </w:pPr>
+            <w:r>
+              <w:rPr>
+                <w:sz w:val="20"/>
+              </w:rPr>
+              <w:t>Sin rubro en el presupuesto</w:t>
+            </w:r>
+          </w:p>
+        </w:tc>
+      </w:tr>
+      <w:tr>
+        <w:trPr>
+          <w:cantSplit/>
+        </w:trPr>
+        <w:tc>
+          <w:tcPr>
+            <w:tcW w:type="dxa" w:w="698"/>
+          </w:tcPr>
+          <w:p>
+            <w:pPr>
+              <w:keepNext/>
+              <w:spacing w:after="0" w:line="240" w:lineRule="auto"/>
+              <w:jc w:val="left"/>
+            </w:pPr>
+            <w:r>
+              <w:rPr>
+                <w:sz w:val="20"/>
+              </w:rPr>
+              <w:t>5</w:t>
+            </w:r>
+          </w:p>
+        </w:tc>
+        <w:tc>
+          <w:tcPr>
+            <w:tcW w:type="dxa" w:w="2791"/>
+          </w:tcPr>
+          <w:p>
+            <w:pPr>
+              <w:keepNext/>
+              <w:spacing w:after="0" w:line="240" w:lineRule="auto"/>
+              <w:jc w:val="left"/>
+            </w:pPr>
+            <w:r>
+              <w:rPr>
+                <w:sz w:val="20"/>
+              </w:rPr>
+              <w:t>Encuesta postventa con el módulo Encuestas de Odoo</w:t>
+            </w:r>
+          </w:p>
+        </w:tc>
+        <w:tc>
+          <w:tcPr>
+            <w:tcW w:type="dxa" w:w="2791"/>
+          </w:tcPr>
+          <w:p>
+            <w:pPr>
+              <w:keepNext/>
+              <w:spacing w:after="0" w:line="240" w:lineRule="auto"/>
+              <w:jc w:val="left"/>
+            </w:pPr>
+            <w:r>
+              <w:rPr>
+                <w:sz w:val="20"/>
+              </w:rPr>
+              <w:t>Permite medir la satisfacción postventa, el único indicador de la Fase 1 sin medición</w:t>
+            </w:r>
+          </w:p>
+        </w:tc>
+        <w:tc>
+          <w:tcPr>
+            <w:tcW w:type="dxa" w:w="2791"/>
+          </w:tcPr>
+          <w:p>
+            <w:pPr>
+              <w:keepNext/>
+              <w:spacing w:after="0" w:line="240" w:lineRule="auto"/>
+              <w:jc w:val="left"/>
+            </w:pPr>
+            <w:r>
+              <w:rPr>
+                <w:sz w:val="20"/>
+              </w:rPr>
+              <w:t>Sin costo de licencia</w:t>
+            </w:r>
+          </w:p>
+        </w:tc>
+      </w:tr>
+      <w:tr>
+        <w:trPr>
+          <w:cantSplit/>
+        </w:trPr>
+        <w:tc>
+          <w:tcPr>
+            <w:tcW w:type="dxa" w:w="698"/>
+          </w:tcPr>
+          <w:p>
+            <w:pPr>
+              <w:keepNext/>
+              <w:spacing w:after="0" w:line="240" w:lineRule="auto"/>
+              <w:jc w:val="left"/>
+            </w:pPr>
+            <w:r>
+              <w:rPr>
+                <w:sz w:val="20"/>
+              </w:rPr>
+              <w:t>6</w:t>
+            </w:r>
+          </w:p>
+        </w:tc>
+        <w:tc>
+          <w:tcPr>
+            <w:tcW w:type="dxa" w:w="2791"/>
+          </w:tcPr>
+          <w:p>
+            <w:pPr>
+              <w:keepNext/>
+              <w:spacing w:after="0" w:line="240" w:lineRule="auto"/>
+              <w:jc w:val="left"/>
+            </w:pPr>
+            <w:r>
+              <w:rPr>
+                <w:sz w:val="20"/>
+              </w:rPr>
+              <w:t>Análisis histórico con Power BI Desktop sobre una réplica de la base</w:t>
+            </w:r>
+          </w:p>
+        </w:tc>
+        <w:tc>
+          <w:tcPr>
+            <w:tcW w:type="dxa" w:w="2791"/>
+          </w:tcPr>
+          <w:p>
+            <w:pPr>
+              <w:keepNext/>
+              <w:spacing w:after="0" w:line="240" w:lineRule="auto"/>
+              <w:jc w:val="left"/>
+            </w:pPr>
+            <w:r>
+              <w:rPr>
+                <w:sz w:val="20"/>
+              </w:rPr>
+              <w:t>Tendencias de varios meses sin cargar la base que atiende el sitio</w:t>
+            </w:r>
+          </w:p>
+        </w:tc>
+        <w:tc>
+          <w:tcPr>
+            <w:tcW w:type="dxa" w:w="2791"/>
+          </w:tcPr>
+          <w:p>
+            <w:pPr>
+              <w:keepNext/>
+              <w:spacing w:after="0" w:line="240" w:lineRule="auto"/>
+              <w:jc w:val="left"/>
+            </w:pPr>
+            <w:r>
+              <w:rPr>
+                <w:sz w:val="20"/>
+              </w:rPr>
+              <w:t>Q 0 (versión de escritorio)</w:t>
+            </w:r>
+          </w:p>
+        </w:tc>
+      </w:tr>
+      <w:tr>
+        <w:trPr>
+          <w:cantSplit/>
+        </w:trPr>
+        <w:tc>
+          <w:tcPr>
+            <w:tcW w:type="dxa" w:w="698"/>
+          </w:tcPr>
+          <w:p>
+            <w:pPr>
+              <w:keepNext w:val="0"/>
+              <w:spacing w:after="0" w:line="240" w:lineRule="auto"/>
+              <w:jc w:val="left"/>
+            </w:pPr>
+            <w:r>
+              <w:rPr>
+                <w:sz w:val="20"/>
+              </w:rPr>
+              <w:t>7</w:t>
+            </w:r>
+          </w:p>
+        </w:tc>
+        <w:tc>
+          <w:tcPr>
+            <w:tcW w:type="dxa" w:w="2791"/>
+          </w:tcPr>
+          <w:p>
+            <w:pPr>
+              <w:keepNext w:val="0"/>
+              <w:spacing w:after="0" w:line="240" w:lineRule="auto"/>
+              <w:jc w:val="left"/>
+            </w:pPr>
+            <w:r>
+              <w:rPr>
+                <w:sz w:val="20"/>
+              </w:rPr>
+              <w:t>Zonas de entrega para Sacatepéquez, Chimaltenango y Escuintla</w:t>
+            </w:r>
+          </w:p>
+        </w:tc>
+        <w:tc>
+          <w:tcPr>
+            <w:tcW w:type="dxa" w:w="2791"/>
+          </w:tcPr>
+          <w:p>
+            <w:pPr>
+              <w:keepNext w:val="0"/>
+              <w:spacing w:after="0" w:line="240" w:lineRule="auto"/>
+              <w:jc w:val="left"/>
+            </w:pPr>
+            <w:r>
+              <w:rPr>
+                <w:sz w:val="20"/>
+              </w:rPr>
+              <w:t>La expansión prevista en el caso. Exige métodos de envío por zona y revisar la meta de entrega en menos de 24 horas fuera del área metropolitana</w:t>
+            </w:r>
+          </w:p>
+        </w:tc>
+        <w:tc>
+          <w:tcPr>
+            <w:tcW w:type="dxa" w:w="2791"/>
+          </w:tcPr>
+          <w:p>
+            <w:pPr>
+              <w:keepNext w:val="0"/>
+              <w:spacing w:after="0" w:line="240" w:lineRule="auto"/>
+              <w:jc w:val="left"/>
+            </w:pPr>
+            <w:r>
+              <w:rPr>
+                <w:sz w:val="20"/>
+              </w:rPr>
+              <w:t>Sin rubro en el presupuesto</w:t>
+            </w:r>
+          </w:p>
+        </w:tc>
+      </w:tr>
+    </w:tbl>
+    <w:p/>
+    <w:p>
+      <w:r>
+        <w:t>La primera mejora condiciona a las demás. Sin un servidor permanente no tiene sentido contratar el dominio, la pasarela ni el correo, porque el sitio deja de existir cada vez que se apaga el equipo que lo hospeda. Las tres mejoras con costo ya forman parte de los Q 67,100 del presupuesto de la Fase 1 y suman Q 4,600 el primer año.</w:t>
+      </w:r>
+    </w:p>
+    <w:p>
+      <w:r>
+        <w:t>El servidor propuesto se dimensionó en la Fase 1 para el volumen del primer trimestre, 200 pedidos. Como el sitio, el ERP y el CRM comparten una sola instancia, crecer no exige integrar nada nuevo: exige más recursos para los mismos contenedores y, cuando el volumen lo justifique, separar la base de datos en su propio servidor. La arquitectura en contenedores definida en la Fase 1 convierte ese paso en un despliegue del mismo archivo de composición, no en una reinstalación.</w:t>
+      </w:r>
+    </w:p>
+    <w:p>
+      <w:r>
+        <w:t>La contrapartida, ya señalada en la Fase 1, es la dependencia del ecosistema Odoo: la integración que este informe demuestra existe porque las tres piezas son el mismo sistema, y sustituir una de ellas obligaría a construir los conectores que hoy no hacen falta.</w:t>
       </w:r>
     </w:p>
     <w:p>
@@ -6333,7 +7034,7 @@
         </w:trPr>
         <w:tc>
           <w:tcPr>
-            <w:tcW w:type="dxa" w:w="1078"/>
+            <w:tcW w:type="dxa" w:w="1382"/>
           </w:tcPr>
           <w:p>
             <w:pPr>
@@ -6352,7 +7053,7 @@
         </w:tc>
         <w:tc>
           <w:tcPr>
-            <w:tcW w:type="dxa" w:w="3772"/>
+            <w:tcW w:type="dxa" w:w="3628"/>
           </w:tcPr>
           <w:p>
             <w:pPr>
@@ -6371,7 +7072,7 @@
         </w:tc>
         <w:tc>
           <w:tcPr>
-            <w:tcW w:type="dxa" w:w="4221"/>
+            <w:tcW w:type="dxa" w:w="4060"/>
           </w:tcPr>
           <w:p>
             <w:pPr>
@@ -6395,7 +7096,7 @@
         </w:trPr>
         <w:tc>
           <w:tcPr>
-            <w:tcW w:type="dxa" w:w="1078"/>
+            <w:tcW w:type="dxa" w:w="1382"/>
           </w:tcPr>
           <w:p>
             <w:pPr>
@@ -6413,7 +7114,7 @@
         </w:tc>
         <w:tc>
           <w:tcPr>
-            <w:tcW w:type="dxa" w:w="3772"/>
+            <w:tcW w:type="dxa" w:w="3628"/>
           </w:tcPr>
           <w:p>
             <w:pPr>
@@ -6431,7 +7132,7 @@
         </w:tc>
         <w:tc>
           <w:tcPr>
-            <w:tcW w:type="dxa" w:w="4221"/>
+            <w:tcW w:type="dxa" w:w="4060"/>
           </w:tcPr>
           <w:p>
             <w:pPr>
@@ -6454,7 +7155,7 @@
         </w:trPr>
         <w:tc>
           <w:tcPr>
-            <w:tcW w:type="dxa" w:w="1078"/>
+            <w:tcW w:type="dxa" w:w="1382"/>
           </w:tcPr>
           <w:p>
             <w:pPr>
@@ -6472,7 +7173,7 @@
         </w:tc>
         <w:tc>
           <w:tcPr>
-            <w:tcW w:type="dxa" w:w="3772"/>
+            <w:tcW w:type="dxa" w:w="3628"/>
           </w:tcPr>
           <w:p>
             <w:pPr>
@@ -6490,7 +7191,7 @@
         </w:tc>
         <w:tc>
           <w:tcPr>
-            <w:tcW w:type="dxa" w:w="4221"/>
+            <w:tcW w:type="dxa" w:w="4060"/>
           </w:tcPr>
           <w:p>
             <w:pPr>
@@ -6513,7 +7214,7 @@
         </w:trPr>
         <w:tc>
           <w:tcPr>
-            <w:tcW w:type="dxa" w:w="1078"/>
+            <w:tcW w:type="dxa" w:w="1382"/>
           </w:tcPr>
           <w:p>
             <w:pPr>
@@ -6531,7 +7232,7 @@
         </w:tc>
         <w:tc>
           <w:tcPr>
-            <w:tcW w:type="dxa" w:w="3772"/>
+            <w:tcW w:type="dxa" w:w="3628"/>
           </w:tcPr>
           <w:p>
             <w:pPr>
@@ -6549,7 +7250,7 @@
         </w:tc>
         <w:tc>
           <w:tcPr>
-            <w:tcW w:type="dxa" w:w="4221"/>
+            <w:tcW w:type="dxa" w:w="4060"/>
           </w:tcPr>
           <w:p>
             <w:pPr>
@@ -6572,7 +7273,7 @@
         </w:trPr>
         <w:tc>
           <w:tcPr>
-            <w:tcW w:type="dxa" w:w="1078"/>
+            <w:tcW w:type="dxa" w:w="1382"/>
           </w:tcPr>
           <w:p>
             <w:pPr>
@@ -6590,7 +7291,7 @@
         </w:tc>
         <w:tc>
           <w:tcPr>
-            <w:tcW w:type="dxa" w:w="3772"/>
+            <w:tcW w:type="dxa" w:w="3628"/>
           </w:tcPr>
           <w:p>
             <w:pPr>
@@ -6608,7 +7309,7 @@
         </w:tc>
         <w:tc>
           <w:tcPr>
-            <w:tcW w:type="dxa" w:w="4221"/>
+            <w:tcW w:type="dxa" w:w="4060"/>
           </w:tcPr>
           <w:p>
             <w:pPr>
@@ -6631,7 +7332,7 @@
         </w:trPr>
         <w:tc>
           <w:tcPr>
-            <w:tcW w:type="dxa" w:w="1078"/>
+            <w:tcW w:type="dxa" w:w="1382"/>
           </w:tcPr>
           <w:p>
             <w:pPr>
@@ -6649,7 +7350,7 @@
         </w:tc>
         <w:tc>
           <w:tcPr>
-            <w:tcW w:type="dxa" w:w="3772"/>
+            <w:tcW w:type="dxa" w:w="3628"/>
           </w:tcPr>
           <w:p>
             <w:pPr>
@@ -6667,7 +7368,7 @@
         </w:tc>
         <w:tc>
           <w:tcPr>
-            <w:tcW w:type="dxa" w:w="4221"/>
+            <w:tcW w:type="dxa" w:w="4060"/>
           </w:tcPr>
           <w:p>
             <w:pPr>

</xml_diff>